<commit_message>
FN4: audit fixes (speech says 'f of the quantity x plus 3', no positional feedback, 'goes to' for point moves, label placement, CheckIt model answer), audit notes, README row
Co-Authored-By: Claude Opus 5.5 <noreply@anthropic.com>
Claude-Session: https://claude.ai/code/session_013Y8PfETWcMLvmUEpCdE8Wq
</commit_message>
<xml_diff>
--- a/support-materials/FN4/FN4_worked_examples.docx
+++ b/support-materials/FN4/FN4_worked_examples.docx
@@ -594,7 +594,7 @@
         <w:t xml:space="preserve">+5</w:t>
       </w:r>
       <w:r>
-        <w:t xml:space="preserve"> shifts up 5, and it comes last: if you shifted up 5 first and then reflected, the graph would land 5 below the axis instead. </w:t>
+        <w:t xml:space="preserve"> shifts up 5, and it comes last: if you shifted up 5 first and then reflected, the graph would end up 5 below the reflected graph instead of 5 above it. </w:t>
       </w:r>
       <w:r>
         <w:rPr>
@@ -855,7 +855,7 @@
       <w:r>
         <w:drawing>
           <wp:inline distT="0" distB="0" distL="0" distR="0">
-            <wp:extent cx="2505075" cy="2476500"/>
+            <wp:extent cx="2524125" cy="2476500"/>
             <wp:effectExtent t="0" r="0" b="0" l="0"/>
             <wp:docPr id="1" name="tp1" descr="The graph of f, a parabola piece from x = −2 to x = 2. Plotted data: The graph of f on a grid from −8 to 8 in both directions. It is an arch of the parabola y = 4 − x squared, drawn only from x = −2 to x = 2. It starts at the point (−2, 0), rises to its top point (0, 4), and comes back down to (2, 0). All three points are labeled." title="The graph of f, a parabola piece from x = −2 to x = 2"/>
             <wp:cNvGraphicFramePr>
@@ -880,7 +880,7 @@
                   <pic:spPr bwMode="auto">
                     <a:xfrm>
                       <a:off x="0" y="0"/>
-                      <a:ext cx="2505075" cy="2476500"/>
+                      <a:ext cx="2524125" cy="2476500"/>
                     </a:xfrm>
                     <a:prstGeom prst="rect">
                       <a:avLst/>
@@ -1068,7 +1068,17 @@
           <w:i/>
           <w:iCs/>
         </w:rPr>
-        <w:t xml:space="preserve">(−2,0)→(1,1)</w:t>
+        <w:t xml:space="preserve">(−2,0)</w:t>
+      </w:r>
+      <w:r>
+        <w:t xml:space="preserve"> goes to </w:t>
+      </w:r>
+      <w:r>
+        <w:rPr>
+          <w:i/>
+          <w:iCs/>
+        </w:rPr>
+        <w:t xml:space="preserve">(1,1)</w:t>
       </w:r>
       <w:r>
         <w:t xml:space="preserve"> and </w:t>
@@ -1078,7 +1088,17 @@
           <w:i/>
           <w:iCs/>
         </w:rPr>
-        <w:t xml:space="preserve">(2,0)→(5,1)</w:t>
+        <w:t xml:space="preserve">(2,0)</w:t>
+      </w:r>
+      <w:r>
+        <w:t xml:space="preserve"> goes to </w:t>
+      </w:r>
+      <w:r>
+        <w:rPr>
+          <w:i/>
+          <w:iCs/>
+        </w:rPr>
+        <w:t xml:space="preserve">(5,1)</w:t>
       </w:r>
       <w:r>
         <w:t xml:space="preserve">. Sketch those three points and draw the same arch through them. </w:t>
@@ -1116,7 +1136,7 @@
       <w:r>
         <w:drawing>
           <wp:inline distT="0" distB="0" distL="0" distR="0">
-            <wp:extent cx="2514600" cy="2476500"/>
+            <wp:extent cx="2524125" cy="2476500"/>
             <wp:effectExtent t="0" r="0" b="0" l="0"/>
             <wp:docPr id="1" name="tp2" descr="The graph of f, an upper semicircle from x = −2 to x = 2. Plotted data: The graph of f on a grid from −8 to 8 in both directions. It is the top half of a circle of radius 2 centered at the origin. It starts at (−2, 0), rises to its top point (0, 2), and comes back down to (2, 0). All three points are labeled." title="The graph of f, an upper semicircle from x = −2 to x = 2"/>
             <wp:cNvGraphicFramePr>
@@ -1141,7 +1161,7 @@
                   <pic:spPr bwMode="auto">
                     <a:xfrm>
                       <a:off x="0" y="0"/>
-                      <a:ext cx="2514600" cy="2476500"/>
+                      <a:ext cx="2524125" cy="2476500"/>
                     </a:xfrm>
                     <a:prstGeom prst="rect">
                       <a:avLst/>
@@ -1400,7 +1420,7 @@
       <w:r>
         <w:drawing>
           <wp:inline distT="0" distB="0" distL="0" distR="0">
-            <wp:extent cx="2514600" cy="2476500"/>
+            <wp:extent cx="2524125" cy="2476500"/>
             <wp:effectExtent t="0" r="0" b="0" l="0"/>
             <wp:docPr id="1" name="tp3" descr="The graph of f, a tent shape from x = −2 to x = 2. Plotted data: The graph of f on a grid from −8 to 8 in both directions. It is a tent made of two straight segments: from (−2, 2) up to the peak (0, 4), then down to (2, 2). All three points are labeled." title="The graph of f, a tent shape from x = −2 to x = 2"/>
             <wp:cNvGraphicFramePr>
@@ -1425,7 +1445,7 @@
                   <pic:spPr bwMode="auto">
                     <a:xfrm>
                       <a:off x="0" y="0"/>
-                      <a:ext cx="2514600" cy="2476500"/>
+                      <a:ext cx="2524125" cy="2476500"/>
                     </a:xfrm>
                     <a:prstGeom prst="rect">
                       <a:avLst/>
@@ -1576,7 +1596,17 @@
           <w:i/>
           <w:iCs/>
         </w:rPr>
-        <w:t xml:space="preserve">(−2,2)→(−4,−3)</w:t>
+        <w:t xml:space="preserve">(−2,2)</w:t>
+      </w:r>
+      <w:r>
+        <w:t xml:space="preserve"> goes to </w:t>
+      </w:r>
+      <w:r>
+        <w:rPr>
+          <w:i/>
+          <w:iCs/>
+        </w:rPr>
+        <w:t xml:space="preserve">(−4,−3)</w:t>
       </w:r>
       <w:r>
         <w:t xml:space="preserve">, </w:t>
@@ -1586,7 +1616,17 @@
           <w:i/>
           <w:iCs/>
         </w:rPr>
-        <w:t xml:space="preserve">(0,4)→(−2,−1)</w:t>
+        <w:t xml:space="preserve">(0,4)</w:t>
+      </w:r>
+      <w:r>
+        <w:t xml:space="preserve"> goes to </w:t>
+      </w:r>
+      <w:r>
+        <w:rPr>
+          <w:i/>
+          <w:iCs/>
+        </w:rPr>
+        <w:t xml:space="preserve">(−2,−1)</w:t>
       </w:r>
       <w:r>
         <w:t xml:space="preserve">, </w:t>
@@ -1596,7 +1636,17 @@
           <w:i/>
           <w:iCs/>
         </w:rPr>
-        <w:t xml:space="preserve">(2,2)→(0,−3)</w:t>
+        <w:t xml:space="preserve">(2,2)</w:t>
+      </w:r>
+      <w:r>
+        <w:t xml:space="preserve"> goes to </w:t>
+      </w:r>
+      <w:r>
+        <w:rPr>
+          <w:i/>
+          <w:iCs/>
+        </w:rPr>
+        <w:t xml:space="preserve">(0,−3)</w:t>
       </w:r>
       <w:r>
         <w:t xml:space="preserve">. The tent keeps its shape, with its peak now at </w:t>
@@ -1674,7 +1724,7 @@
       <w:r>
         <w:drawing>
           <wp:inline distT="0" distB="0" distL="0" distR="0">
-            <wp:extent cx="2514600" cy="2476500"/>
+            <wp:extent cx="2524125" cy="2476500"/>
             <wp:effectExtent t="0" r="0" b="0" l="0"/>
             <wp:docPr id="1" name="tp4" descr="The graph of f, a bowl-shaped parabola piece from x = −2 to x = 2. Plotted data: The graph of f on a grid from −8 to 8 in both directions. It is a piece of the parabola y = x squared − 4, drawn only from x = −2 to x = 2. It starts at (−2, 0), goes down to its lowest point (0, −4), and comes back up to (2, 0). All three points are labeled." title="The graph of f, a bowl-shaped parabola piece from x = −2 to x = 2"/>
             <wp:cNvGraphicFramePr>
@@ -1699,7 +1749,7 @@
                   <pic:spPr bwMode="auto">
                     <a:xfrm>
                       <a:off x="0" y="0"/>
-                      <a:ext cx="2514600" cy="2476500"/>
+                      <a:ext cx="2524125" cy="2476500"/>
                     </a:xfrm>
                     <a:prstGeom prst="rect">
                       <a:avLst/>
@@ -1938,7 +1988,7 @@
       <w:r>
         <w:drawing>
           <wp:inline distT="0" distB="0" distL="0" distR="0">
-            <wp:extent cx="2514600" cy="2476500"/>
+            <wp:extent cx="2524125" cy="2476500"/>
             <wp:effectExtent t="0" r="0" b="0" l="0"/>
             <wp:docPr id="1" name="mg1" descr="The graph of f, dashed, and the graph of g, solid. Plotted data: Grid from −8 to 8. Dashed: the graph of f, the arch y = 4 − x squared from (−2, 0) up to (0, 4) and down to (2, 0). Solid: the graph of g, the same arch shape from (−5, −2) up to its top point (−3, 2) and down to (−1, −2). The three points of g are labeled." title="The graph of f, dashed, and the graph of g, solid"/>
             <wp:cNvGraphicFramePr>
@@ -1963,7 +2013,7 @@
                   <pic:spPr bwMode="auto">
                     <a:xfrm>
                       <a:off x="0" y="0"/>
-                      <a:ext cx="2514600" cy="2476500"/>
+                      <a:ext cx="2524125" cy="2476500"/>
                     </a:xfrm>
                     <a:prstGeom prst="rect">
                       <a:avLst/>
@@ -2168,7 +2218,17 @@
         <w:t xml:space="preserve">+2</w:t>
       </w:r>
       <w:r>
-        <w:t xml:space="preserve"> version goes up, and the third one swaps the 3 and the 2. </w:t>
+        <w:t xml:space="preserve"> version goes up, and </w:t>
+      </w:r>
+      <w:r>
+        <w:rPr>
+          <w:i/>
+          <w:iCs/>
+        </w:rPr>
+        <w:t xml:space="preserve">f(x+2)−3</w:t>
+      </w:r>
+      <w:r>
+        <w:t xml:space="preserve"> swaps the 3 and the 2. </w:t>
       </w:r>
       <w:r>
         <w:rPr>
@@ -2203,7 +2263,7 @@
       <w:r>
         <w:drawing>
           <wp:inline distT="0" distB="0" distL="0" distR="0">
-            <wp:extent cx="2514600" cy="2476500"/>
+            <wp:extent cx="2524125" cy="2476500"/>
             <wp:effectExtent t="0" r="0" b="0" l="0"/>
             <wp:docPr id="1" name="mg2" descr="The graph of f, dashed, and the graph of g, solid. Plotted data: Grid from −8 to 8. Dashed: the graph of f, the upper semicircle from (−2, 0) up to (0, 2) and down to (2, 0). Solid: the graph of g, a bowl-shaped half circle that starts at (0, 1), goes down to its lowest point (2, −1), and comes back up to (4, 1). The three points of g are labeled." title="The graph of f, dashed, and the graph of g, solid"/>
             <wp:cNvGraphicFramePr>
@@ -2228,7 +2288,7 @@
                   <pic:spPr bwMode="auto">
                     <a:xfrm>
                       <a:off x="0" y="0"/>
-                      <a:ext cx="2514600" cy="2476500"/>
+                      <a:ext cx="2524125" cy="2476500"/>
                     </a:xfrm>
                     <a:prstGeom prst="rect">
                       <a:avLst/>
@@ -2488,7 +2548,7 @@
       <w:r>
         <w:drawing>
           <wp:inline distT="0" distB="0" distL="0" distR="0">
-            <wp:extent cx="2514600" cy="2476500"/>
+            <wp:extent cx="2524125" cy="2476500"/>
             <wp:effectExtent t="0" r="0" b="0" l="0"/>
             <wp:docPr id="1" name="mg3" descr="The graph of f, dashed, and the graph of g, solid. Plotted data: Grid from −8 to 8. Dashed: the graph of f, the tent from (−2, 2) up to (0, 4) and down to (2, 2). Solid: the graph of g, a V shape from (−3, 0) down to its lowest point (−1, −2) and back up to (1, 0). The three points of g are labeled." title="The graph of f, dashed, and the graph of g, solid"/>
             <wp:cNvGraphicFramePr>
@@ -2513,7 +2573,7 @@
                   <pic:spPr bwMode="auto">
                     <a:xfrm>
                       <a:off x="0" y="0"/>
-                      <a:ext cx="2514600" cy="2476500"/>
+                      <a:ext cx="2524125" cy="2476500"/>
                     </a:xfrm>
                     <a:prstGeom prst="rect">
                       <a:avLst/>
@@ -2728,17 +2788,17 @@
         <w:t xml:space="preserve">f(x+1)−2</w:t>
       </w:r>
       <w:r>
-        <w:t xml:space="preserve"> has no reflection, so its tent would point up, and </w:t>
-      </w:r>
-      <w:r>
-        <w:rPr>
-          <w:i/>
-          <w:iCs/>
-        </w:rPr>
-        <w:t xml:space="preserve">−2</w:t>
-      </w:r>
-      <w:r>
-        <w:t xml:space="preserve"> at the end would put the low point at </w:t>
+        <w:t xml:space="preserve"> has no reflection, so its tent would point up. The formula </w:t>
+      </w:r>
+      <w:r>
+        <w:rPr>
+          <w:i/>
+          <w:iCs/>
+        </w:rPr>
+        <w:t xml:space="preserve">−f(x+1)−2</w:t>
+      </w:r>
+      <w:r>
+        <w:t xml:space="preserve"> would put the low point at </w:t>
       </w:r>
       <w:r>
         <w:rPr>
@@ -2748,7 +2808,17 @@
         <w:t xml:space="preserve">−6</w:t>
       </w:r>
       <w:r>
-        <w:t xml:space="preserve">. </w:t>
+        <w:t xml:space="preserve">, and </w:t>
+      </w:r>
+      <w:r>
+        <w:rPr>
+          <w:i/>
+          <w:iCs/>
+        </w:rPr>
+        <w:t xml:space="preserve">−f(x−1)+2</w:t>
+      </w:r>
+      <w:r>
+        <w:t xml:space="preserve"> goes right. </w:t>
       </w:r>
       <w:r>
         <w:rPr>
@@ -2783,7 +2853,7 @@
       <w:r>
         <w:drawing>
           <wp:inline distT="0" distB="0" distL="0" distR="0">
-            <wp:extent cx="2505075" cy="2476500"/>
+            <wp:extent cx="2524125" cy="2476500"/>
             <wp:effectExtent t="0" r="0" b="0" l="0"/>
             <wp:docPr id="1" name="mg4" descr="The graph of f, dashed, and the graph of g, solid. Plotted data: Grid from −8 to 8. Dashed: the graph of f, the bowl y = x squared − 4 from (−2, 0) down to (0, −4) and up to (2, 0). Solid: the graph of g, the same bowl shape from (3, 3) down to its lowest point (5, −1) and up to (7, 3). The three points of g are labeled." title="The graph of f, dashed, and the graph of g, solid"/>
             <wp:cNvGraphicFramePr>
@@ -2808,7 +2878,7 @@
                   <pic:spPr bwMode="auto">
                     <a:xfrm>
                       <a:off x="0" y="0"/>
-                      <a:ext cx="2505075" cy="2476500"/>
+                      <a:ext cx="2524125" cy="2476500"/>
                     </a:xfrm>
                     <a:prstGeom prst="rect">
                       <a:avLst/>
@@ -2993,7 +3063,17 @@
         <w:t xml:space="preserve">x+5</w:t>
       </w:r>
       <w:r>
-        <w:t xml:space="preserve"> version goes left, the third one swaps the 5 and the 3, and the minus in front would turn the bowl into an arch. </w:t>
+        <w:t xml:space="preserve"> version goes left, </w:t>
+      </w:r>
+      <w:r>
+        <w:rPr>
+          <w:i/>
+          <w:iCs/>
+        </w:rPr>
+        <w:t xml:space="preserve">f(x−3)+5</w:t>
+      </w:r>
+      <w:r>
+        <w:t xml:space="preserve"> swaps the 5 and the 3, and the minus in front would turn the bowl into an arch. </w:t>
       </w:r>
       <w:r>
         <w:rPr>
@@ -3098,7 +3178,7 @@
         <w:t xml:space="preserve">C.  </w:t>
       </w:r>
       <w:r>
-        <w:t xml:space="preserve">A plus inside the parentheses shifts left, so it is left 3.</w:t>
+        <w:t xml:space="preserve">A plus inside shifts left, so it is left 3.</w:t>
       </w:r>
     </w:p>
     <w:p>
@@ -3114,7 +3194,7 @@
         <w:t xml:space="preserve">D.  </w:t>
       </w:r>
       <w:r>
-        <w:t xml:space="preserve">It is a reflection across the y-axis, followed by a shift right.</w:t>
+        <w:t xml:space="preserve">It is a reflection across the y-axis, then a shift right.</w:t>
       </w:r>
     </w:p>
     <w:p>
@@ -3141,7 +3221,7 @@
         <w:t xml:space="preserve">x=0</w:t>
       </w:r>
       <w:r>
-        <w:t xml:space="preserve"> now happens at </w:t>
+        <w:t xml:space="preserve"> now appears at </w:t>
       </w:r>
       <w:r>
         <w:rPr>
@@ -3314,7 +3394,17 @@
           <w:i/>
           <w:iCs/>
         </w:rPr>
-        <w:t xml:space="preserve">(0,4)→(4,3)</w:t>
+        <w:t xml:space="preserve">(0,4)</w:t>
+      </w:r>
+      <w:r>
+        <w:t xml:space="preserve"> goes to </w:t>
+      </w:r>
+      <w:r>
+        <w:rPr>
+          <w:i/>
+          <w:iCs/>
+        </w:rPr>
+        <w:t xml:space="preserve">(4,3)</w:t>
       </w:r>
       <w:r>
         <w:t xml:space="preserve">. Check: </w:t>
@@ -3649,7 +3739,17 @@
           <w:i/>
           <w:iCs/>
         </w:rPr>
-        <w:t xml:space="preserve">(x,y)→(x,−y)</w:t>
+        <w:t xml:space="preserve">(x,y)</w:t>
+      </w:r>
+      <w:r>
+        <w:t xml:space="preserve"> goes to </w:t>
+      </w:r>
+      <w:r>
+        <w:rPr>
+          <w:i/>
+          <w:iCs/>
+        </w:rPr>
+        <w:t xml:space="preserve">(x,−y)</w:t>
       </w:r>
       <w:r>
         <w:t xml:space="preserve">. That flips the graph across the </w:t>
@@ -3692,7 +3792,7 @@
         <w:t xml:space="preserve">x</w:t>
       </w:r>
       <w:r>
-        <w:t xml:space="preserve">. </w:t>
+        <w:t xml:space="preserve">. For CheckIt's three shapes, which are symmetric, that would not change the graph at all. </w:t>
       </w:r>
       <w:r>
         <w:rPr>

</xml_diff>

<commit_message>
FN4: add horizontal reflection f(-x) (class and written homework, not on CheckIt): summary row and a 4-item Try It tab
Co-Authored-By: Claude Opus 5.5 <noreply@anthropic.com>
Claude-Session: https://claude.ai/code/session_013Y8PfETWcMLvmUEpCdE8Wq
</commit_message>
<xml_diff>
--- a/support-materials/FN4/FN4_worked_examples.docx
+++ b/support-materials/FN4/FN4_worked_examples.docx
@@ -3098,7 +3098,73 @@
         <w:pageBreakBefore/>
       </w:pPr>
       <w:r>
-        <w:t xml:space="preserve">Example 13: Slip 1</w:t>
+        <w:t xml:space="preserve">Example 13: Reflect 1</w:t>
+      </w:r>
+    </w:p>
+    <w:p>
+      <w:pPr>
+        <w:spacing w:after="60" w:before="60"/>
+      </w:pPr>
+      <w:r>
+        <w:drawing>
+          <wp:inline distT="0" distB="0" distL="0" distR="0">
+            <wp:extent cx="4457700" cy="2476500"/>
+            <wp:effectExtent t="0" r="0" b="0" l="0"/>
+            <wp:docPr id="1" name="hr1" descr="The graph of f(x) = square root of x. Plotted data: The graph of f(x) = square root of x on a grid from −8 to 8 across and −4 to 4 up. It starts at the origin (0, 0) and rises to the right, more and more slowly, through (1, 1) and (4, 2). All three points are labeled. There is no graph to the left of the y-axis." title="The graph of f(x) = square root of x"/>
+            <wp:cNvGraphicFramePr>
+              <a:graphicFrameLocks xmlns:a="http://schemas.openxmlformats.org/drawingml/2006/main" noChangeAspect="1"/>
+            </wp:cNvGraphicFramePr>
+            <a:graphic xmlns:a="http://schemas.openxmlformats.org/drawingml/2006/main">
+              <a:graphicData uri="http://schemas.openxmlformats.org/drawingml/2006/picture">
+                <pic:pic xmlns:pic="http://schemas.openxmlformats.org/drawingml/2006/picture">
+                  <pic:nvPicPr>
+                    <pic:cNvPr id="0" name="" descr=""/>
+                    <pic:cNvPicPr>
+                      <a:picLocks noChangeAspect="1" noChangeArrowheads="1"/>
+                    </pic:cNvPicPr>
+                  </pic:nvPicPr>
+                  <pic:blipFill>
+                    <a:blip r:embed="rId17" cstate="none"/>
+                    <a:srcRect/>
+                    <a:stretch>
+                      <a:fillRect/>
+                    </a:stretch>
+                  </pic:blipFill>
+                  <pic:spPr bwMode="auto">
+                    <a:xfrm>
+                      <a:off x="0" y="0"/>
+                      <a:ext cx="4457700" cy="2476500"/>
+                    </a:xfrm>
+                    <a:prstGeom prst="rect">
+                      <a:avLst/>
+                    </a:prstGeom>
+                  </pic:spPr>
+                </pic:pic>
+              </a:graphicData>
+            </a:graphic>
+          </wp:inline>
+        </w:drawing>
+      </w:r>
+    </w:p>
+    <w:p>
+      <w:pPr>
+        <w:spacing w:after="120" w:before="80" w:line="300"/>
+      </w:pPr>
+      <w:r>
+        <w:rPr>
+          <w:b/>
+          <w:bCs/>
+          <w:sz w:val="22"/>
+          <w:szCs w:val="22"/>
+        </w:rPr>
+        <w:t xml:space="preserve">Plotted data: </w:t>
+      </w:r>
+      <w:r>
+        <w:rPr>
+          <w:sz w:val="22"/>
+          <w:szCs w:val="22"/>
+        </w:rPr>
+        <w:t xml:space="preserve">The graph of f(x) = square root of x on a grid from −8 to 8 across and −4 to 4 up. It starts at the origin (0, 0) and rises to the right, more and more slowly, through (1, 1) and (4, 2). All three points are labeled. There is no graph to the left of the y-axis.</w:t>
       </w:r>
     </w:p>
     <w:p>
@@ -3113,7 +3179,7 @@
           <w:sz w:val="40"/>
           <w:szCs w:val="40"/>
         </w:rPr>
-        <w:t xml:space="preserve">g(x)=f(x+3)</w:t>
+        <w:t xml:space="preserve">g(x)=f(−x)</w:t>
       </w:r>
     </w:p>
     <w:p>
@@ -3130,7 +3196,7 @@
         <w:spacing w:after="120" w:before="80" w:line="300"/>
       </w:pPr>
       <w:r>
-        <w:t xml:space="preserve">A student says the graph of g is the graph of f shifted right 3, because the sign is plus. What is the mistake, if any?</w:t>
+        <w:t xml:space="preserve">The point (4, 2) is on the graph of f. Which point is on the graph of g?</w:t>
       </w:r>
     </w:p>
     <w:p>
@@ -3146,7 +3212,7 @@
         <w:t xml:space="preserve">A.  </w:t>
       </w:r>
       <w:r>
-        <w:t xml:space="preserve">There is no mistake.</w:t>
+        <w:t xml:space="preserve">(4, −2)</w:t>
       </w:r>
     </w:p>
     <w:p>
@@ -3162,7 +3228,7 @@
         <w:t xml:space="preserve">B.  </w:t>
       </w:r>
       <w:r>
-        <w:t xml:space="preserve">It is a shift up 3, because it adds 3.</w:t>
+        <w:t xml:space="preserve">(−4, −2)</w:t>
       </w:r>
     </w:p>
     <w:p>
@@ -3178,7 +3244,7 @@
         <w:t xml:space="preserve">C.  </w:t>
       </w:r>
       <w:r>
-        <w:t xml:space="preserve">A plus inside shifts left, so it is left 3.</w:t>
+        <w:t xml:space="preserve">(−4, 2)</w:t>
       </w:r>
     </w:p>
     <w:p>
@@ -3194,7 +3260,7 @@
         <w:t xml:space="preserve">D.  </w:t>
       </w:r>
       <w:r>
-        <w:t xml:space="preserve">It is a reflection across the y-axis, then a shift right.</w:t>
+        <w:t xml:space="preserve">(2, 4)</w:t>
       </w:r>
     </w:p>
     <w:p>
@@ -3211,44 +3277,140 @@
         <w:spacing w:after="120" w:before="80" w:line="300"/>
       </w:pPr>
       <w:r>
-        <w:t xml:space="preserve">Inside the parentheses, the shift goes the opposite way from the sign. The point that was at </w:t>
-      </w:r>
-      <w:r>
-        <w:rPr>
-          <w:i/>
-          <w:iCs/>
-        </w:rPr>
-        <w:t xml:space="preserve">x=0</w:t>
-      </w:r>
-      <w:r>
-        <w:t xml:space="preserve"> now appears at </w:t>
-      </w:r>
-      <w:r>
-        <w:rPr>
-          <w:i/>
-          <w:iCs/>
-        </w:rPr>
-        <w:t xml:space="preserve">x=−3</w:t>
-      </w:r>
-      <w:r>
-        <w:t xml:space="preserve">, since </w:t>
-      </w:r>
-      <w:r>
-        <w:rPr>
-          <w:i/>
-          <w:iCs/>
-        </w:rPr>
-        <w:t xml:space="preserve">g(−3)=f(0)</w:t>
-      </w:r>
-      <w:r>
-        <w:t xml:space="preserve">. </w:t>
-      </w:r>
-      <w:r>
-        <w:rPr>
-          <w:b/>
-          <w:bCs/>
-        </w:rPr>
-        <w:t xml:space="preserve">The graph shifts left 3.</w:t>
+        <w:rPr>
+          <w:i/>
+          <w:iCs/>
+        </w:rPr>
+        <w:t xml:space="preserve">g(−4)=f(4)=2</w:t>
+      </w:r>
+      <w:r>
+        <w:t xml:space="preserve">, because </w:t>
+      </w:r>
+      <w:r>
+        <w:rPr>
+          <w:i/>
+          <w:iCs/>
+        </w:rPr>
+        <w:t xml:space="preserve">−(−4)=4</w:t>
+      </w:r>
+      <w:r>
+        <w:t xml:space="preserve">, so </w:t>
+      </w:r>
+      <w:r>
+        <w:rPr>
+          <w:i/>
+          <w:iCs/>
+        </w:rPr>
+        <w:t xml:space="preserve">(−4,2)</w:t>
+      </w:r>
+      <w:r>
+        <w:t xml:space="preserve"> is on </w:t>
+      </w:r>
+      <w:r>
+        <w:rPr>
+          <w:i/>
+          <w:iCs/>
+        </w:rPr>
+        <w:t xml:space="preserve">g</w:t>
+      </w:r>
+      <w:r>
+        <w:t xml:space="preserve">. The input changes sign and the output stays the same: </w:t>
+      </w:r>
+      <w:r>
+        <w:rPr>
+          <w:i/>
+          <w:iCs/>
+        </w:rPr>
+        <w:t xml:space="preserve">(x,y)</w:t>
+      </w:r>
+      <w:r>
+        <w:t xml:space="preserve"> goes to </w:t>
+      </w:r>
+      <w:r>
+        <w:rPr>
+          <w:i/>
+          <w:iCs/>
+        </w:rPr>
+        <w:t xml:space="preserve">(−x,y)</w:t>
+      </w:r>
+      <w:r>
+        <w:t xml:space="preserve">. The whole graph of </w:t>
+      </w:r>
+      <w:r>
+        <w:rPr>
+          <w:i/>
+          <w:iCs/>
+        </w:rPr>
+        <w:t xml:space="preserve">√x</w:t>
+      </w:r>
+      <w:r>
+        <w:t xml:space="preserve"> flips to the left side of the </w:t>
+      </w:r>
+      <w:r>
+        <w:rPr>
+          <w:i/>
+          <w:iCs/>
+        </w:rPr>
+        <w:t xml:space="preserve">y</w:t>
+      </w:r>
+      <w:r>
+        <w:t xml:space="preserve">-axis. The point </w:t>
+      </w:r>
+      <w:r>
+        <w:rPr>
+          <w:i/>
+          <w:iCs/>
+        </w:rPr>
+        <w:t xml:space="preserve">(4,−2)</w:t>
+      </w:r>
+      <w:r>
+        <w:t xml:space="preserve"> is the reflection across the </w:t>
+      </w:r>
+      <w:r>
+        <w:rPr>
+          <w:i/>
+          <w:iCs/>
+        </w:rPr>
+        <w:t xml:space="preserve">x</w:t>
+      </w:r>
+      <w:r>
+        <w:t xml:space="preserve">-axis, </w:t>
+      </w:r>
+      <w:r>
+        <w:rPr>
+          <w:i/>
+          <w:iCs/>
+        </w:rPr>
+        <w:t xml:space="preserve">−f(x)</w:t>
+      </w:r>
+      <w:r>
+        <w:t xml:space="preserve">, and </w:t>
+      </w:r>
+      <w:r>
+        <w:rPr>
+          <w:i/>
+          <w:iCs/>
+        </w:rPr>
+        <w:t xml:space="preserve">(−4,−2)</w:t>
+      </w:r>
+      <w:r>
+        <w:t xml:space="preserve"> reflects across both axes. </w:t>
+      </w:r>
+      <w:r>
+        <w:rPr>
+          <w:b/>
+          <w:bCs/>
+          <w:i/>
+          <w:iCs/>
+        </w:rPr>
+        <w:t xml:space="preserve">(−4,2)</w:t>
+      </w:r>
+      <w:r>
+        <w:rPr>
+          <w:b/>
+          <w:bCs/>
+        </w:rPr>
+        <w:t xml:space="preserve">.</w:t>
       </w:r>
     </w:p>
     <w:p>
@@ -3257,7 +3419,7 @@
         <w:pageBreakBefore/>
       </w:pPr>
       <w:r>
-        <w:t xml:space="preserve">Example 14: Slip 2</w:t>
+        <w:t xml:space="preserve">Example 14: Reflect 2</w:t>
       </w:r>
     </w:p>
     <w:p>
@@ -3272,7 +3434,7 @@
           <w:sz w:val="40"/>
           <w:szCs w:val="40"/>
         </w:rPr>
-        <w:t xml:space="preserve">g(x)=f(x−4)−1</w:t>
+        <w:t xml:space="preserve">y=f(x)</w:t>
       </w:r>
     </w:p>
     <w:p>
@@ -3289,7 +3451,7 @@
         <w:spacing w:after="120" w:before="80" w:line="300"/>
       </w:pPr>
       <w:r>
-        <w:t xml:space="preserve">A student says the point (0, 4) on f moves to (4, 3) on g. What is the mistake, if any?</w:t>
+        <w:t xml:space="preserve">Which formula reflects the graph of f across the y-axis?</w:t>
       </w:r>
     </w:p>
     <w:p>
@@ -3305,7 +3467,11 @@
         <w:t xml:space="preserve">A.  </w:t>
       </w:r>
       <w:r>
-        <w:t xml:space="preserve">There is no mistake.</w:t>
+        <w:rPr>
+          <w:i/>
+          <w:iCs/>
+        </w:rPr>
+        <w:t xml:space="preserve">−f(x)</w:t>
       </w:r>
     </w:p>
     <w:p>
@@ -3321,7 +3487,11 @@
         <w:t xml:space="preserve">B.  </w:t>
       </w:r>
       <w:r>
-        <w:t xml:space="preserve">It should be (−4, 3), since x − 4 moves left.</w:t>
+        <w:rPr>
+          <w:i/>
+          <w:iCs/>
+        </w:rPr>
+        <w:t xml:space="preserve">f(−x)</w:t>
       </w:r>
     </w:p>
     <w:p>
@@ -3337,7 +3507,11 @@
         <w:t xml:space="preserve">C.  </w:t>
       </w:r>
       <w:r>
-        <w:t xml:space="preserve">It should be (4, 5), since − 1 moves up.</w:t>
+        <w:rPr>
+          <w:i/>
+          <w:iCs/>
+        </w:rPr>
+        <w:t xml:space="preserve">−f(−x)</w:t>
       </w:r>
     </w:p>
     <w:p>
@@ -3353,7 +3527,11 @@
         <w:t xml:space="preserve">D.  </w:t>
       </w:r>
       <w:r>
-        <w:t xml:space="preserve">It should be (−4, 5), moving left and up.</w:t>
+        <w:rPr>
+          <w:i/>
+          <w:iCs/>
+        </w:rPr>
+        <w:t xml:space="preserve">f(x)−1</w:t>
       </w:r>
     </w:p>
     <w:p>
@@ -3370,51 +3548,74 @@
         <w:spacing w:after="120" w:before="80" w:line="300"/>
       </w:pPr>
       <w:r>
-        <w:rPr>
-          <w:i/>
-          <w:iCs/>
-        </w:rPr>
-        <w:t xml:space="preserve">x−4</w:t>
-      </w:r>
-      <w:r>
-        <w:t xml:space="preserve"> moves right 4, and </w:t>
-      </w:r>
-      <w:r>
-        <w:rPr>
-          <w:i/>
-          <w:iCs/>
-        </w:rPr>
-        <w:t xml:space="preserve">−1</w:t>
-      </w:r>
-      <w:r>
-        <w:t xml:space="preserve"> moves down 1: </w:t>
-      </w:r>
-      <w:r>
-        <w:rPr>
-          <w:i/>
-          <w:iCs/>
-        </w:rPr>
-        <w:t xml:space="preserve">(0,4)</w:t>
-      </w:r>
-      <w:r>
-        <w:t xml:space="preserve"> goes to </w:t>
-      </w:r>
-      <w:r>
-        <w:rPr>
-          <w:i/>
-          <w:iCs/>
-        </w:rPr>
-        <w:t xml:space="preserve">(4,3)</w:t>
-      </w:r>
-      <w:r>
-        <w:t xml:space="preserve">. Check: </w:t>
-      </w:r>
-      <w:r>
-        <w:rPr>
-          <w:i/>
-          <w:iCs/>
-        </w:rPr>
-        <w:t xml:space="preserve">g(4)=f(4−4)−1=f(0)−1=4−1=3</w:t>
+        <w:t xml:space="preserve">A reflection across the </w:t>
+      </w:r>
+      <w:r>
+        <w:rPr>
+          <w:i/>
+          <w:iCs/>
+        </w:rPr>
+        <w:t xml:space="preserve">y</w:t>
+      </w:r>
+      <w:r>
+        <w:t xml:space="preserve">-axis swaps left and right, so it changes the inputs: </w:t>
+      </w:r>
+      <w:r>
+        <w:rPr>
+          <w:i/>
+          <w:iCs/>
+        </w:rPr>
+        <w:t xml:space="preserve">f(−x)</w:t>
+      </w:r>
+      <w:r>
+        <w:t xml:space="preserve">. A minus outside, </w:t>
+      </w:r>
+      <w:r>
+        <w:rPr>
+          <w:i/>
+          <w:iCs/>
+        </w:rPr>
+        <w:t xml:space="preserve">−f(x)</w:t>
+      </w:r>
+      <w:r>
+        <w:t xml:space="preserve">, changes the outputs, which reflects across the </w:t>
+      </w:r>
+      <w:r>
+        <w:rPr>
+          <w:i/>
+          <w:iCs/>
+        </w:rPr>
+        <w:t xml:space="preserve">x</w:t>
+      </w:r>
+      <w:r>
+        <w:t xml:space="preserve">-axis. Both minus signs, </w:t>
+      </w:r>
+      <w:r>
+        <w:rPr>
+          <w:i/>
+          <w:iCs/>
+        </w:rPr>
+        <w:t xml:space="preserve">−f(−x)</w:t>
+      </w:r>
+      <w:r>
+        <w:t xml:space="preserve">, reflect across both axes. Memory hook: a minus inside changes </w:t>
+      </w:r>
+      <w:r>
+        <w:rPr>
+          <w:i/>
+          <w:iCs/>
+        </w:rPr>
+        <w:t xml:space="preserve">x</w:t>
+      </w:r>
+      <w:r>
+        <w:t xml:space="preserve">, a minus outside changes </w:t>
+      </w:r>
+      <w:r>
+        <w:rPr>
+          <w:i/>
+          <w:iCs/>
+        </w:rPr>
+        <w:t xml:space="preserve">y</w:t>
       </w:r>
       <w:r>
         <w:t xml:space="preserve">. </w:t>
@@ -3423,8 +3624,17 @@
         <w:rPr>
           <w:b/>
           <w:bCs/>
-        </w:rPr>
-        <w:t xml:space="preserve">There is no mistake.</w:t>
+          <w:i/>
+          <w:iCs/>
+        </w:rPr>
+        <w:t xml:space="preserve">f(−x)</w:t>
+      </w:r>
+      <w:r>
+        <w:rPr>
+          <w:b/>
+          <w:bCs/>
+        </w:rPr>
+        <w:t xml:space="preserve">.</w:t>
       </w:r>
     </w:p>
     <w:p>
@@ -3433,7 +3643,7 @@
         <w:pageBreakBefore/>
       </w:pPr>
       <w:r>
-        <w:t xml:space="preserve">Example 15: Slip 3</w:t>
+        <w:t xml:space="preserve">Example 15: Reflect 3</w:t>
       </w:r>
     </w:p>
     <w:p>
@@ -3448,7 +3658,26 @@
           <w:sz w:val="40"/>
           <w:szCs w:val="40"/>
         </w:rPr>
-        <w:t xml:space="preserve">g(x)=−f(x−1)+2</w:t>
+        <w:t xml:space="preserve">f(x)=x</w:t>
+      </w:r>
+      <w:r>
+        <w:rPr>
+          <w:i/>
+          <w:iCs/>
+          <w:sz w:val="40"/>
+          <w:szCs w:val="40"/>
+          <w:vertAlign w:val="superscript"/>
+        </w:rPr>
+        <w:t xml:space="preserve">2</w:t>
+      </w:r>
+      <w:r>
+        <w:rPr>
+          <w:i/>
+          <w:iCs/>
+          <w:sz w:val="40"/>
+          <w:szCs w:val="40"/>
+        </w:rPr>
+        <w:t xml:space="preserve">+3x</w:t>
       </w:r>
     </w:p>
     <w:p>
@@ -3465,7 +3694,7 @@
         <w:spacing w:after="120" w:before="80" w:line="300"/>
       </w:pPr>
       <w:r>
-        <w:t xml:space="preserve">A student described g as: shift right 1, shift up 2, then reflect across the x-axis. What is the mistake, if any?</w:t>
+        <w:t xml:space="preserve">What is f(−x), simplified?</w:t>
       </w:r>
     </w:p>
     <w:p>
@@ -3481,7 +3710,26 @@
         <w:t xml:space="preserve">A.  </w:t>
       </w:r>
       <w:r>
-        <w:t xml:space="preserve">There is no mistake; the order does not matter.</w:t>
+        <w:rPr>
+          <w:i/>
+          <w:iCs/>
+        </w:rPr>
+        <w:t xml:space="preserve">−x</w:t>
+      </w:r>
+      <w:r>
+        <w:rPr>
+          <w:i/>
+          <w:iCs/>
+          <w:vertAlign w:val="superscript"/>
+        </w:rPr>
+        <w:t xml:space="preserve">2</w:t>
+      </w:r>
+      <w:r>
+        <w:rPr>
+          <w:i/>
+          <w:iCs/>
+        </w:rPr>
+        <w:t xml:space="preserve">−3x</w:t>
       </w:r>
     </w:p>
     <w:p>
@@ -3497,7 +3745,26 @@
         <w:t xml:space="preserve">B.  </w:t>
       </w:r>
       <w:r>
-        <w:t xml:space="preserve">It should shift left 1, not right 1.</w:t>
+        <w:rPr>
+          <w:i/>
+          <w:iCs/>
+        </w:rPr>
+        <w:t xml:space="preserve">−x</w:t>
+      </w:r>
+      <w:r>
+        <w:rPr>
+          <w:i/>
+          <w:iCs/>
+          <w:vertAlign w:val="superscript"/>
+        </w:rPr>
+        <w:t xml:space="preserve">2</w:t>
+      </w:r>
+      <w:r>
+        <w:rPr>
+          <w:i/>
+          <w:iCs/>
+        </w:rPr>
+        <w:t xml:space="preserve">+3x</w:t>
       </w:r>
     </w:p>
     <w:p>
@@ -3513,7 +3780,26 @@
         <w:t xml:space="preserve">C.  </w:t>
       </w:r>
       <w:r>
-        <w:t xml:space="preserve">The reflection should be across the y-axis, not the x-axis.</w:t>
+        <w:rPr>
+          <w:i/>
+          <w:iCs/>
+        </w:rPr>
+        <w:t xml:space="preserve">x</w:t>
+      </w:r>
+      <w:r>
+        <w:rPr>
+          <w:i/>
+          <w:iCs/>
+          <w:vertAlign w:val="superscript"/>
+        </w:rPr>
+        <w:t xml:space="preserve">2</w:t>
+      </w:r>
+      <w:r>
+        <w:rPr>
+          <w:i/>
+          <w:iCs/>
+        </w:rPr>
+        <w:t xml:space="preserve">+3x</w:t>
       </w:r>
     </w:p>
     <w:p>
@@ -3529,7 +3815,26 @@
         <w:t xml:space="preserve">D.  </w:t>
       </w:r>
       <w:r>
-        <w:t xml:space="preserve">The reflection has to come before the shift up 2.</w:t>
+        <w:rPr>
+          <w:i/>
+          <w:iCs/>
+        </w:rPr>
+        <w:t xml:space="preserve">x</w:t>
+      </w:r>
+      <w:r>
+        <w:rPr>
+          <w:i/>
+          <w:iCs/>
+          <w:vertAlign w:val="superscript"/>
+        </w:rPr>
+        <w:t xml:space="preserve">2</w:t>
+      </w:r>
+      <w:r>
+        <w:rPr>
+          <w:i/>
+          <w:iCs/>
+        </w:rPr>
+        <w:t xml:space="preserve">−3x</w:t>
       </w:r>
     </w:p>
     <w:p>
@@ -3546,44 +3851,231 @@
         <w:spacing w:after="120" w:before="80" w:line="300"/>
       </w:pPr>
       <w:r>
-        <w:t xml:space="preserve">The minus multiplies </w:t>
-      </w:r>
-      <w:r>
-        <w:rPr>
-          <w:i/>
-          <w:iCs/>
-        </w:rPr>
-        <w:t xml:space="preserve">f(x−1)</w:t>
-      </w:r>
-      <w:r>
-        <w:t xml:space="preserve">, not the </w:t>
-      </w:r>
-      <w:r>
-        <w:rPr>
-          <w:i/>
-          <w:iCs/>
-        </w:rPr>
-        <w:t xml:space="preserve">+2</w:t>
-      </w:r>
-      <w:r>
-        <w:t xml:space="preserve">. So reflect first, then shift up 2. The student's order gives </w:t>
-      </w:r>
-      <w:r>
-        <w:rPr>
-          <w:i/>
-          <w:iCs/>
-        </w:rPr>
-        <w:t xml:space="preserve">−(f(x−1)+2)=−f(x−1)−2</w:t>
-      </w:r>
-      <w:r>
-        <w:t xml:space="preserve">, which ends up 4 lower. </w:t>
-      </w:r>
-      <w:r>
-        <w:rPr>
-          <w:b/>
-          <w:bCs/>
-        </w:rPr>
-        <w:t xml:space="preserve">Right 1, reflect across the x-axis, then up 2.</w:t>
+        <w:t xml:space="preserve">Replace every </w:t>
+      </w:r>
+      <w:r>
+        <w:rPr>
+          <w:i/>
+          <w:iCs/>
+        </w:rPr>
+        <w:t xml:space="preserve">x</w:t>
+      </w:r>
+      <w:r>
+        <w:t xml:space="preserve"> with </w:t>
+      </w:r>
+      <w:r>
+        <w:rPr>
+          <w:i/>
+          <w:iCs/>
+        </w:rPr>
+        <w:t xml:space="preserve">(−x)</w:t>
+      </w:r>
+      <w:r>
+        <w:t xml:space="preserve">, parentheses included: </w:t>
+      </w:r>
+      <w:r>
+        <w:rPr>
+          <w:i/>
+          <w:iCs/>
+        </w:rPr>
+        <w:t xml:space="preserve">f(−x)=(−x)</w:t>
+      </w:r>
+      <w:r>
+        <w:rPr>
+          <w:i/>
+          <w:iCs/>
+          <w:vertAlign w:val="superscript"/>
+        </w:rPr>
+        <w:t xml:space="preserve">2</w:t>
+      </w:r>
+      <w:r>
+        <w:rPr>
+          <w:i/>
+          <w:iCs/>
+        </w:rPr>
+        <w:t xml:space="preserve">+3(−x)=x</w:t>
+      </w:r>
+      <w:r>
+        <w:rPr>
+          <w:i/>
+          <w:iCs/>
+          <w:vertAlign w:val="superscript"/>
+        </w:rPr>
+        <w:t xml:space="preserve">2</w:t>
+      </w:r>
+      <w:r>
+        <w:rPr>
+          <w:i/>
+          <w:iCs/>
+        </w:rPr>
+        <w:t xml:space="preserve">−3x</w:t>
+      </w:r>
+      <w:r>
+        <w:t xml:space="preserve">. The square makes </w:t>
+      </w:r>
+      <w:r>
+        <w:rPr>
+          <w:i/>
+          <w:iCs/>
+        </w:rPr>
+        <w:t xml:space="preserve">(−x)</w:t>
+      </w:r>
+      <w:r>
+        <w:rPr>
+          <w:i/>
+          <w:iCs/>
+          <w:vertAlign w:val="superscript"/>
+        </w:rPr>
+        <w:t xml:space="preserve">2</w:t>
+      </w:r>
+      <w:r>
+        <w:rPr>
+          <w:i/>
+          <w:iCs/>
+        </w:rPr>
+        <w:t xml:space="preserve">=x</w:t>
+      </w:r>
+      <w:r>
+        <w:rPr>
+          <w:i/>
+          <w:iCs/>
+          <w:vertAlign w:val="superscript"/>
+        </w:rPr>
+        <w:t xml:space="preserve">2</w:t>
+      </w:r>
+      <w:r>
+        <w:t xml:space="preserve">, so only the odd-power term changes sign. The answer </w:t>
+      </w:r>
+      <w:r>
+        <w:rPr>
+          <w:i/>
+          <w:iCs/>
+        </w:rPr>
+        <w:t xml:space="preserve">−x</w:t>
+      </w:r>
+      <w:r>
+        <w:rPr>
+          <w:i/>
+          <w:iCs/>
+          <w:vertAlign w:val="superscript"/>
+        </w:rPr>
+        <w:t xml:space="preserve">2</w:t>
+      </w:r>
+      <w:r>
+        <w:rPr>
+          <w:i/>
+          <w:iCs/>
+        </w:rPr>
+        <w:t xml:space="preserve">−3x</w:t>
+      </w:r>
+      <w:r>
+        <w:t xml:space="preserve"> is </w:t>
+      </w:r>
+      <w:r>
+        <w:rPr>
+          <w:i/>
+          <w:iCs/>
+        </w:rPr>
+        <w:t xml:space="preserve">−f(x)</w:t>
+      </w:r>
+      <w:r>
+        <w:t xml:space="preserve">, which multiplies the outputs instead, and </w:t>
+      </w:r>
+      <w:r>
+        <w:rPr>
+          <w:i/>
+          <w:iCs/>
+        </w:rPr>
+        <w:t xml:space="preserve">−x</w:t>
+      </w:r>
+      <w:r>
+        <w:rPr>
+          <w:i/>
+          <w:iCs/>
+          <w:vertAlign w:val="superscript"/>
+        </w:rPr>
+        <w:t xml:space="preserve">2</w:t>
+      </w:r>
+      <w:r>
+        <w:rPr>
+          <w:i/>
+          <w:iCs/>
+        </w:rPr>
+        <w:t xml:space="preserve">+3x</w:t>
+      </w:r>
+      <w:r>
+        <w:t xml:space="preserve"> forgets the parentheses: </w:t>
+      </w:r>
+      <w:r>
+        <w:rPr>
+          <w:i/>
+          <w:iCs/>
+        </w:rPr>
+        <w:t xml:space="preserve">−x</w:t>
+      </w:r>
+      <w:r>
+        <w:rPr>
+          <w:i/>
+          <w:iCs/>
+          <w:vertAlign w:val="superscript"/>
+        </w:rPr>
+        <w:t xml:space="preserve">2</w:t>
+      </w:r>
+      <w:r>
+        <w:t xml:space="preserve"> is not </w:t>
+      </w:r>
+      <w:r>
+        <w:rPr>
+          <w:i/>
+          <w:iCs/>
+        </w:rPr>
+        <w:t xml:space="preserve">(−x)</w:t>
+      </w:r>
+      <w:r>
+        <w:rPr>
+          <w:i/>
+          <w:iCs/>
+          <w:vertAlign w:val="superscript"/>
+        </w:rPr>
+        <w:t xml:space="preserve">2</w:t>
+      </w:r>
+      <w:r>
+        <w:t xml:space="preserve">. </w:t>
+      </w:r>
+      <w:r>
+        <w:rPr>
+          <w:b/>
+          <w:bCs/>
+          <w:i/>
+          <w:iCs/>
+        </w:rPr>
+        <w:t xml:space="preserve">f(−x)=x</w:t>
+      </w:r>
+      <w:r>
+        <w:rPr>
+          <w:b/>
+          <w:bCs/>
+          <w:i/>
+          <w:iCs/>
+          <w:vertAlign w:val="superscript"/>
+        </w:rPr>
+        <w:t xml:space="preserve">2</w:t>
+      </w:r>
+      <w:r>
+        <w:rPr>
+          <w:b/>
+          <w:bCs/>
+          <w:i/>
+          <w:iCs/>
+        </w:rPr>
+        <w:t xml:space="preserve">−3x</w:t>
+      </w:r>
+      <w:r>
+        <w:rPr>
+          <w:b/>
+          <w:bCs/>
+        </w:rPr>
+        <w:t xml:space="preserve">.</w:t>
       </w:r>
     </w:p>
     <w:p>
@@ -3592,7 +4084,310 @@
         <w:pageBreakBefore/>
       </w:pPr>
       <w:r>
-        <w:t xml:space="preserve">Example 16: Slip 4</w:t>
+        <w:t xml:space="preserve">Example 16: Reflect 4</w:t>
+      </w:r>
+    </w:p>
+    <w:p>
+      <w:pPr>
+        <w:spacing w:after="60" w:before="60"/>
+      </w:pPr>
+      <w:r>
+        <w:drawing>
+          <wp:inline distT="0" distB="0" distL="0" distR="0">
+            <wp:extent cx="4457700" cy="2476500"/>
+            <wp:effectExtent t="0" r="0" b="0" l="0"/>
+            <wp:docPr id="1" name="hr4" descr="The graph of f(x) = 4 − x squared on [−2, 2]. Plotted data: The graph of f(x) = 4 − x squared from x = −2 to x = 2: an arch from (−2, 0) up to its top point (0, 4) and back down to (2, 0). The points (−1, 3), (0, 4), and (1, 3) are labeled." title="The graph of f(x) = 4 − x squared on [−2, 2]"/>
+            <wp:cNvGraphicFramePr>
+              <a:graphicFrameLocks xmlns:a="http://schemas.openxmlformats.org/drawingml/2006/main" noChangeAspect="1"/>
+            </wp:cNvGraphicFramePr>
+            <a:graphic xmlns:a="http://schemas.openxmlformats.org/drawingml/2006/main">
+              <a:graphicData uri="http://schemas.openxmlformats.org/drawingml/2006/picture">
+                <pic:pic xmlns:pic="http://schemas.openxmlformats.org/drawingml/2006/picture">
+                  <pic:nvPicPr>
+                    <pic:cNvPr id="0" name="" descr=""/>
+                    <pic:cNvPicPr>
+                      <a:picLocks noChangeAspect="1" noChangeArrowheads="1"/>
+                    </pic:cNvPicPr>
+                  </pic:nvPicPr>
+                  <pic:blipFill>
+                    <a:blip r:embed="rId18" cstate="none"/>
+                    <a:srcRect/>
+                    <a:stretch>
+                      <a:fillRect/>
+                    </a:stretch>
+                  </pic:blipFill>
+                  <pic:spPr bwMode="auto">
+                    <a:xfrm>
+                      <a:off x="0" y="0"/>
+                      <a:ext cx="4457700" cy="2476500"/>
+                    </a:xfrm>
+                    <a:prstGeom prst="rect">
+                      <a:avLst/>
+                    </a:prstGeom>
+                  </pic:spPr>
+                </pic:pic>
+              </a:graphicData>
+            </a:graphic>
+          </wp:inline>
+        </w:drawing>
+      </w:r>
+    </w:p>
+    <w:p>
+      <w:pPr>
+        <w:spacing w:after="120" w:before="80" w:line="300"/>
+      </w:pPr>
+      <w:r>
+        <w:rPr>
+          <w:b/>
+          <w:bCs/>
+          <w:sz w:val="22"/>
+          <w:szCs w:val="22"/>
+        </w:rPr>
+        <w:t xml:space="preserve">Plotted data: </w:t>
+      </w:r>
+      <w:r>
+        <w:rPr>
+          <w:sz w:val="22"/>
+          <w:szCs w:val="22"/>
+        </w:rPr>
+        <w:t xml:space="preserve">The graph of f(x) = 4 − x squared from x = −2 to x = 2: an arch from (−2, 0) up to its top point (0, 4) and back down to (2, 0). The points (−1, 3), (0, 4), and (1, 3) are labeled.</w:t>
+      </w:r>
+    </w:p>
+    <w:p>
+      <w:pPr>
+        <w:pStyle w:val="Heading3"/>
+        <w:keepNext/>
+      </w:pPr>
+      <w:r>
+        <w:t xml:space="preserve">Question</w:t>
+      </w:r>
+    </w:p>
+    <w:p>
+      <w:pPr>
+        <w:spacing w:after="120" w:before="80" w:line="300"/>
+      </w:pPr>
+      <w:r>
+        <w:t xml:space="preserve">This is one of CheckIt's graphs. What does the graph of g(x) = f(−x) look like?</w:t>
+      </w:r>
+    </w:p>
+    <w:p>
+      <w:pPr>
+        <w:spacing w:after="40" w:before="20"/>
+        <w:ind w:left="360"/>
+      </w:pPr>
+      <w:r>
+        <w:rPr>
+          <w:b/>
+          <w:bCs/>
+        </w:rPr>
+        <w:t xml:space="preserve">A.  </w:t>
+      </w:r>
+      <w:r>
+        <w:t xml:space="preserve">The same arch, upside down</w:t>
+      </w:r>
+    </w:p>
+    <w:p>
+      <w:pPr>
+        <w:spacing w:after="40" w:before="20"/>
+        <w:ind w:left="360"/>
+      </w:pPr>
+      <w:r>
+        <w:rPr>
+          <w:b/>
+          <w:bCs/>
+        </w:rPr>
+        <w:t xml:space="preserve">B.  </w:t>
+      </w:r>
+      <w:r>
+        <w:t xml:space="preserve">Exactly the same arch</w:t>
+      </w:r>
+    </w:p>
+    <w:p>
+      <w:pPr>
+        <w:spacing w:after="40" w:before="20"/>
+        <w:ind w:left="360"/>
+      </w:pPr>
+      <w:r>
+        <w:rPr>
+          <w:b/>
+          <w:bCs/>
+        </w:rPr>
+        <w:t xml:space="preserve">C.  </w:t>
+      </w:r>
+      <w:r>
+        <w:t xml:space="preserve">The same arch, moved left</w:t>
+      </w:r>
+    </w:p>
+    <w:p>
+      <w:pPr>
+        <w:spacing w:after="40" w:before="20"/>
+        <w:ind w:left="360"/>
+      </w:pPr>
+      <w:r>
+        <w:rPr>
+          <w:b/>
+          <w:bCs/>
+        </w:rPr>
+        <w:t xml:space="preserve">D.  </w:t>
+      </w:r>
+      <w:r>
+        <w:t xml:space="preserve">The same arch, moved right</w:t>
+      </w:r>
+    </w:p>
+    <w:p>
+      <w:pPr>
+        <w:pStyle w:val="Heading3"/>
+        <w:keepNext/>
+      </w:pPr>
+      <w:r>
+        <w:t xml:space="preserve">Answer and reasoning</w:t>
+      </w:r>
+    </w:p>
+    <w:p>
+      <w:pPr>
+        <w:spacing w:after="120" w:before="80" w:line="300"/>
+      </w:pPr>
+      <w:r>
+        <w:t xml:space="preserve">Reflecting across the </w:t>
+      </w:r>
+      <w:r>
+        <w:rPr>
+          <w:i/>
+          <w:iCs/>
+        </w:rPr>
+        <w:t xml:space="preserve">y</w:t>
+      </w:r>
+      <w:r>
+        <w:t xml:space="preserve">-axis sends </w:t>
+      </w:r>
+      <w:r>
+        <w:rPr>
+          <w:i/>
+          <w:iCs/>
+        </w:rPr>
+        <w:t xml:space="preserve">(1,3)</w:t>
+      </w:r>
+      <w:r>
+        <w:t xml:space="preserve"> to </w:t>
+      </w:r>
+      <w:r>
+        <w:rPr>
+          <w:i/>
+          <w:iCs/>
+        </w:rPr>
+        <w:t xml:space="preserve">(−1,3)</w:t>
+      </w:r>
+      <w:r>
+        <w:t xml:space="preserve"> and </w:t>
+      </w:r>
+      <w:r>
+        <w:rPr>
+          <w:i/>
+          <w:iCs/>
+        </w:rPr>
+        <w:t xml:space="preserve">(−1,3)</w:t>
+      </w:r>
+      <w:r>
+        <w:t xml:space="preserve"> to </w:t>
+      </w:r>
+      <w:r>
+        <w:rPr>
+          <w:i/>
+          <w:iCs/>
+        </w:rPr>
+        <w:t xml:space="preserve">(1,3)</w:t>
+      </w:r>
+      <w:r>
+        <w:t xml:space="preserve">: those points were already mirror images, so the graph lands on itself. Algebraically, </w:t>
+      </w:r>
+      <w:r>
+        <w:rPr>
+          <w:i/>
+          <w:iCs/>
+        </w:rPr>
+        <w:t xml:space="preserve">f(−x)=4−(−x)</w:t>
+      </w:r>
+      <w:r>
+        <w:rPr>
+          <w:i/>
+          <w:iCs/>
+          <w:vertAlign w:val="superscript"/>
+        </w:rPr>
+        <w:t xml:space="preserve">2</w:t>
+      </w:r>
+      <w:r>
+        <w:rPr>
+          <w:i/>
+          <w:iCs/>
+        </w:rPr>
+        <w:t xml:space="preserve">=4−x</w:t>
+      </w:r>
+      <w:r>
+        <w:rPr>
+          <w:i/>
+          <w:iCs/>
+          <w:vertAlign w:val="superscript"/>
+        </w:rPr>
+        <w:t xml:space="preserve">2</w:t>
+      </w:r>
+      <w:r>
+        <w:rPr>
+          <w:i/>
+          <w:iCs/>
+        </w:rPr>
+        <w:t xml:space="preserve">=f(x)</w:t>
+      </w:r>
+      <w:r>
+        <w:t xml:space="preserve">. This is true for all three CheckIt shapes, so with them, </w:t>
+      </w:r>
+      <w:r>
+        <w:rPr>
+          <w:i/>
+          <w:iCs/>
+        </w:rPr>
+        <w:t xml:space="preserve">f(−x)</w:t>
+      </w:r>
+      <w:r>
+        <w:t xml:space="preserve"> would not change anything. Upside down would be </w:t>
+      </w:r>
+      <w:r>
+        <w:rPr>
+          <w:i/>
+          <w:iCs/>
+        </w:rPr>
+        <w:t xml:space="preserve">−f(x)</w:t>
+      </w:r>
+      <w:r>
+        <w:t xml:space="preserve">. </w:t>
+      </w:r>
+      <w:r>
+        <w:rPr>
+          <w:b/>
+          <w:bCs/>
+        </w:rPr>
+        <w:t xml:space="preserve">Exactly the same arch.</w:t>
+      </w:r>
+      <w:r>
+        <w:t xml:space="preserve"> On the homework, watch for graphs that are not symmetric, like </w:t>
+      </w:r>
+      <w:r>
+        <w:rPr>
+          <w:i/>
+          <w:iCs/>
+        </w:rPr>
+        <w:t xml:space="preserve">√x</w:t>
+      </w:r>
+      <w:r>
+        <w:t xml:space="preserve">.</w:t>
+      </w:r>
+    </w:p>
+    <w:p>
+      <w:pPr>
+        <w:pStyle w:val="Heading2"/>
+        <w:pageBreakBefore/>
+      </w:pPr>
+      <w:r>
+        <w:t xml:space="preserve">Example 17: Slip 1</w:t>
       </w:r>
     </w:p>
     <w:p>
@@ -3607,7 +4402,7 @@
           <w:sz w:val="40"/>
           <w:szCs w:val="40"/>
         </w:rPr>
-        <w:t xml:space="preserve">g(x)=−f(x)</w:t>
+        <w:t xml:space="preserve">g(x)=f(x+3)</w:t>
       </w:r>
     </w:p>
     <w:p>
@@ -3624,7 +4419,7 @@
         <w:spacing w:after="120" w:before="80" w:line="300"/>
       </w:pPr>
       <w:r>
-        <w:t xml:space="preserve">A student says the graph of g is the graph of f reflected across the y-axis. What is the mistake, if any?</w:t>
+        <w:t xml:space="preserve">A student says the graph of g is the graph of f shifted right 3, because the sign is plus. What is the mistake, if any?</w:t>
       </w:r>
     </w:p>
     <w:p>
@@ -3656,7 +4451,7 @@
         <w:t xml:space="preserve">B.  </w:t>
       </w:r>
       <w:r>
-        <w:t xml:space="preserve">A minus in front reflects across the x-axis instead.</w:t>
+        <w:t xml:space="preserve">It is a shift up 3, because it adds 3.</w:t>
       </w:r>
     </w:p>
     <w:p>
@@ -3672,7 +4467,7 @@
         <w:t xml:space="preserve">C.  </w:t>
       </w:r>
       <w:r>
-        <w:t xml:space="preserve">It is a shift down, because of the minus sign out front.</w:t>
+        <w:t xml:space="preserve">A plus inside shifts left, so it is left 3.</w:t>
       </w:r>
     </w:p>
     <w:p>
@@ -3688,7 +4483,7 @@
         <w:t xml:space="preserve">D.  </w:t>
       </w:r>
       <w:r>
-        <w:t xml:space="preserve">It is a reflection across the line y = x instead.</w:t>
+        <w:t xml:space="preserve">It is a reflection across the y-axis, then a shift right.</w:t>
       </w:r>
     </w:p>
     <w:p>
@@ -3705,101 +4500,44 @@
         <w:spacing w:after="120" w:before="80" w:line="300"/>
       </w:pPr>
       <w:r>
-        <w:rPr>
-          <w:i/>
-          <w:iCs/>
-        </w:rPr>
-        <w:t xml:space="preserve">−f(x)</w:t>
-      </w:r>
-      <w:r>
-        <w:t xml:space="preserve"> keeps every </w:t>
-      </w:r>
-      <w:r>
-        <w:rPr>
-          <w:i/>
-          <w:iCs/>
-        </w:rPr>
-        <w:t xml:space="preserve">x</w:t>
-      </w:r>
-      <w:r>
-        <w:t xml:space="preserve"> and changes the sign of every </w:t>
-      </w:r>
-      <w:r>
-        <w:rPr>
-          <w:i/>
-          <w:iCs/>
-        </w:rPr>
-        <w:t xml:space="preserve">y</w:t>
-      </w:r>
-      <w:r>
-        <w:t xml:space="preserve">: </w:t>
-      </w:r>
-      <w:r>
-        <w:rPr>
-          <w:i/>
-          <w:iCs/>
-        </w:rPr>
-        <w:t xml:space="preserve">(x,y)</w:t>
-      </w:r>
-      <w:r>
-        <w:t xml:space="preserve"> goes to </w:t>
-      </w:r>
-      <w:r>
-        <w:rPr>
-          <w:i/>
-          <w:iCs/>
-        </w:rPr>
-        <w:t xml:space="preserve">(x,−y)</w:t>
-      </w:r>
-      <w:r>
-        <w:t xml:space="preserve">. That flips the graph across the </w:t>
-      </w:r>
-      <w:r>
-        <w:rPr>
-          <w:i/>
-          <w:iCs/>
-        </w:rPr>
-        <w:t xml:space="preserve">x</w:t>
-      </w:r>
-      <w:r>
-        <w:t xml:space="preserve">-axis. A reflection across the </w:t>
-      </w:r>
-      <w:r>
-        <w:rPr>
-          <w:i/>
-          <w:iCs/>
-        </w:rPr>
-        <w:t xml:space="preserve">y</w:t>
-      </w:r>
-      <w:r>
-        <w:t xml:space="preserve">-axis would be </w:t>
-      </w:r>
-      <w:r>
-        <w:rPr>
-          <w:i/>
-          <w:iCs/>
-        </w:rPr>
-        <w:t xml:space="preserve">f(−x)</w:t>
-      </w:r>
-      <w:r>
-        <w:t xml:space="preserve">, which changes the sign of </w:t>
-      </w:r>
-      <w:r>
-        <w:rPr>
-          <w:i/>
-          <w:iCs/>
-        </w:rPr>
-        <w:t xml:space="preserve">x</w:t>
-      </w:r>
-      <w:r>
-        <w:t xml:space="preserve">. For CheckIt's three shapes, which are symmetric, that would not change the graph at all. </w:t>
-      </w:r>
-      <w:r>
-        <w:rPr>
-          <w:b/>
-          <w:bCs/>
-        </w:rPr>
-        <w:t xml:space="preserve">It reflects across the x-axis.</w:t>
+        <w:t xml:space="preserve">Inside the parentheses, the shift goes the opposite way from the sign. The point that was at </w:t>
+      </w:r>
+      <w:r>
+        <w:rPr>
+          <w:i/>
+          <w:iCs/>
+        </w:rPr>
+        <w:t xml:space="preserve">x=0</w:t>
+      </w:r>
+      <w:r>
+        <w:t xml:space="preserve"> now appears at </w:t>
+      </w:r>
+      <w:r>
+        <w:rPr>
+          <w:i/>
+          <w:iCs/>
+        </w:rPr>
+        <w:t xml:space="preserve">x=−3</w:t>
+      </w:r>
+      <w:r>
+        <w:t xml:space="preserve">, since </w:t>
+      </w:r>
+      <w:r>
+        <w:rPr>
+          <w:i/>
+          <w:iCs/>
+        </w:rPr>
+        <w:t xml:space="preserve">g(−3)=f(0)</w:t>
+      </w:r>
+      <w:r>
+        <w:t xml:space="preserve">. </w:t>
+      </w:r>
+      <w:r>
+        <w:rPr>
+          <w:b/>
+          <w:bCs/>
+        </w:rPr>
+        <w:t xml:space="preserve">The graph shifts left 3.</w:t>
       </w:r>
     </w:p>
     <w:p>
@@ -3808,7 +4546,558 @@
         <w:pageBreakBefore/>
       </w:pPr>
       <w:r>
-        <w:t xml:space="preserve">Example 17: Slip 5</w:t>
+        <w:t xml:space="preserve">Example 18: Slip 2</w:t>
+      </w:r>
+    </w:p>
+    <w:p>
+      <w:pPr>
+        <w:spacing w:after="200" w:before="200"/>
+        <w:jc w:val="center"/>
+      </w:pPr>
+      <w:r>
+        <w:rPr>
+          <w:i/>
+          <w:iCs/>
+          <w:sz w:val="40"/>
+          <w:szCs w:val="40"/>
+        </w:rPr>
+        <w:t xml:space="preserve">g(x)=f(x−4)−1</w:t>
+      </w:r>
+    </w:p>
+    <w:p>
+      <w:pPr>
+        <w:pStyle w:val="Heading3"/>
+        <w:keepNext/>
+      </w:pPr>
+      <w:r>
+        <w:t xml:space="preserve">Question</w:t>
+      </w:r>
+    </w:p>
+    <w:p>
+      <w:pPr>
+        <w:spacing w:after="120" w:before="80" w:line="300"/>
+      </w:pPr>
+      <w:r>
+        <w:t xml:space="preserve">A student says the point (0, 4) on f moves to (4, 3) on g. What is the mistake, if any?</w:t>
+      </w:r>
+    </w:p>
+    <w:p>
+      <w:pPr>
+        <w:spacing w:after="40" w:before="20"/>
+        <w:ind w:left="360"/>
+      </w:pPr>
+      <w:r>
+        <w:rPr>
+          <w:b/>
+          <w:bCs/>
+        </w:rPr>
+        <w:t xml:space="preserve">A.  </w:t>
+      </w:r>
+      <w:r>
+        <w:t xml:space="preserve">There is no mistake.</w:t>
+      </w:r>
+    </w:p>
+    <w:p>
+      <w:pPr>
+        <w:spacing w:after="40" w:before="20"/>
+        <w:ind w:left="360"/>
+      </w:pPr>
+      <w:r>
+        <w:rPr>
+          <w:b/>
+          <w:bCs/>
+        </w:rPr>
+        <w:t xml:space="preserve">B.  </w:t>
+      </w:r>
+      <w:r>
+        <w:t xml:space="preserve">It should be (−4, 3), since x − 4 moves left.</w:t>
+      </w:r>
+    </w:p>
+    <w:p>
+      <w:pPr>
+        <w:spacing w:after="40" w:before="20"/>
+        <w:ind w:left="360"/>
+      </w:pPr>
+      <w:r>
+        <w:rPr>
+          <w:b/>
+          <w:bCs/>
+        </w:rPr>
+        <w:t xml:space="preserve">C.  </w:t>
+      </w:r>
+      <w:r>
+        <w:t xml:space="preserve">It should be (4, 5), since − 1 moves up.</w:t>
+      </w:r>
+    </w:p>
+    <w:p>
+      <w:pPr>
+        <w:spacing w:after="40" w:before="20"/>
+        <w:ind w:left="360"/>
+      </w:pPr>
+      <w:r>
+        <w:rPr>
+          <w:b/>
+          <w:bCs/>
+        </w:rPr>
+        <w:t xml:space="preserve">D.  </w:t>
+      </w:r>
+      <w:r>
+        <w:t xml:space="preserve">It should be (−4, 5), moving left and up.</w:t>
+      </w:r>
+    </w:p>
+    <w:p>
+      <w:pPr>
+        <w:pStyle w:val="Heading3"/>
+        <w:keepNext/>
+      </w:pPr>
+      <w:r>
+        <w:t xml:space="preserve">Answer and reasoning</w:t>
+      </w:r>
+    </w:p>
+    <w:p>
+      <w:pPr>
+        <w:spacing w:after="120" w:before="80" w:line="300"/>
+      </w:pPr>
+      <w:r>
+        <w:rPr>
+          <w:i/>
+          <w:iCs/>
+        </w:rPr>
+        <w:t xml:space="preserve">x−4</w:t>
+      </w:r>
+      <w:r>
+        <w:t xml:space="preserve"> moves right 4, and </w:t>
+      </w:r>
+      <w:r>
+        <w:rPr>
+          <w:i/>
+          <w:iCs/>
+        </w:rPr>
+        <w:t xml:space="preserve">−1</w:t>
+      </w:r>
+      <w:r>
+        <w:t xml:space="preserve"> moves down 1: </w:t>
+      </w:r>
+      <w:r>
+        <w:rPr>
+          <w:i/>
+          <w:iCs/>
+        </w:rPr>
+        <w:t xml:space="preserve">(0,4)</w:t>
+      </w:r>
+      <w:r>
+        <w:t xml:space="preserve"> goes to </w:t>
+      </w:r>
+      <w:r>
+        <w:rPr>
+          <w:i/>
+          <w:iCs/>
+        </w:rPr>
+        <w:t xml:space="preserve">(4,3)</w:t>
+      </w:r>
+      <w:r>
+        <w:t xml:space="preserve">. Check: </w:t>
+      </w:r>
+      <w:r>
+        <w:rPr>
+          <w:i/>
+          <w:iCs/>
+        </w:rPr>
+        <w:t xml:space="preserve">g(4)=f(4−4)−1=f(0)−1=4−1=3</w:t>
+      </w:r>
+      <w:r>
+        <w:t xml:space="preserve">. </w:t>
+      </w:r>
+      <w:r>
+        <w:rPr>
+          <w:b/>
+          <w:bCs/>
+        </w:rPr>
+        <w:t xml:space="preserve">There is no mistake.</w:t>
+      </w:r>
+    </w:p>
+    <w:p>
+      <w:pPr>
+        <w:pStyle w:val="Heading2"/>
+        <w:pageBreakBefore/>
+      </w:pPr>
+      <w:r>
+        <w:t xml:space="preserve">Example 19: Slip 3</w:t>
+      </w:r>
+    </w:p>
+    <w:p>
+      <w:pPr>
+        <w:spacing w:after="200" w:before="200"/>
+        <w:jc w:val="center"/>
+      </w:pPr>
+      <w:r>
+        <w:rPr>
+          <w:i/>
+          <w:iCs/>
+          <w:sz w:val="40"/>
+          <w:szCs w:val="40"/>
+        </w:rPr>
+        <w:t xml:space="preserve">g(x)=−f(x−1)+2</w:t>
+      </w:r>
+    </w:p>
+    <w:p>
+      <w:pPr>
+        <w:pStyle w:val="Heading3"/>
+        <w:keepNext/>
+      </w:pPr>
+      <w:r>
+        <w:t xml:space="preserve">Question</w:t>
+      </w:r>
+    </w:p>
+    <w:p>
+      <w:pPr>
+        <w:spacing w:after="120" w:before="80" w:line="300"/>
+      </w:pPr>
+      <w:r>
+        <w:t xml:space="preserve">A student described g as: shift right 1, shift up 2, then reflect across the x-axis. What is the mistake, if any?</w:t>
+      </w:r>
+    </w:p>
+    <w:p>
+      <w:pPr>
+        <w:spacing w:after="40" w:before="20"/>
+        <w:ind w:left="360"/>
+      </w:pPr>
+      <w:r>
+        <w:rPr>
+          <w:b/>
+          <w:bCs/>
+        </w:rPr>
+        <w:t xml:space="preserve">A.  </w:t>
+      </w:r>
+      <w:r>
+        <w:t xml:space="preserve">There is no mistake; the order does not matter.</w:t>
+      </w:r>
+    </w:p>
+    <w:p>
+      <w:pPr>
+        <w:spacing w:after="40" w:before="20"/>
+        <w:ind w:left="360"/>
+      </w:pPr>
+      <w:r>
+        <w:rPr>
+          <w:b/>
+          <w:bCs/>
+        </w:rPr>
+        <w:t xml:space="preserve">B.  </w:t>
+      </w:r>
+      <w:r>
+        <w:t xml:space="preserve">It should shift left 1, not right 1.</w:t>
+      </w:r>
+    </w:p>
+    <w:p>
+      <w:pPr>
+        <w:spacing w:after="40" w:before="20"/>
+        <w:ind w:left="360"/>
+      </w:pPr>
+      <w:r>
+        <w:rPr>
+          <w:b/>
+          <w:bCs/>
+        </w:rPr>
+        <w:t xml:space="preserve">C.  </w:t>
+      </w:r>
+      <w:r>
+        <w:t xml:space="preserve">The reflection should be across the y-axis, not the x-axis.</w:t>
+      </w:r>
+    </w:p>
+    <w:p>
+      <w:pPr>
+        <w:spacing w:after="40" w:before="20"/>
+        <w:ind w:left="360"/>
+      </w:pPr>
+      <w:r>
+        <w:rPr>
+          <w:b/>
+          <w:bCs/>
+        </w:rPr>
+        <w:t xml:space="preserve">D.  </w:t>
+      </w:r>
+      <w:r>
+        <w:t xml:space="preserve">The reflection has to come before the shift up 2.</w:t>
+      </w:r>
+    </w:p>
+    <w:p>
+      <w:pPr>
+        <w:pStyle w:val="Heading3"/>
+        <w:keepNext/>
+      </w:pPr>
+      <w:r>
+        <w:t xml:space="preserve">Answer and reasoning</w:t>
+      </w:r>
+    </w:p>
+    <w:p>
+      <w:pPr>
+        <w:spacing w:after="120" w:before="80" w:line="300"/>
+      </w:pPr>
+      <w:r>
+        <w:t xml:space="preserve">The minus multiplies </w:t>
+      </w:r>
+      <w:r>
+        <w:rPr>
+          <w:i/>
+          <w:iCs/>
+        </w:rPr>
+        <w:t xml:space="preserve">f(x−1)</w:t>
+      </w:r>
+      <w:r>
+        <w:t xml:space="preserve">, not the </w:t>
+      </w:r>
+      <w:r>
+        <w:rPr>
+          <w:i/>
+          <w:iCs/>
+        </w:rPr>
+        <w:t xml:space="preserve">+2</w:t>
+      </w:r>
+      <w:r>
+        <w:t xml:space="preserve">. So reflect first, then shift up 2. The student's order gives </w:t>
+      </w:r>
+      <w:r>
+        <w:rPr>
+          <w:i/>
+          <w:iCs/>
+        </w:rPr>
+        <w:t xml:space="preserve">−(f(x−1)+2)=−f(x−1)−2</w:t>
+      </w:r>
+      <w:r>
+        <w:t xml:space="preserve">, which ends up 4 lower. </w:t>
+      </w:r>
+      <w:r>
+        <w:rPr>
+          <w:b/>
+          <w:bCs/>
+        </w:rPr>
+        <w:t xml:space="preserve">Right 1, reflect across the x-axis, then up 2.</w:t>
+      </w:r>
+    </w:p>
+    <w:p>
+      <w:pPr>
+        <w:pStyle w:val="Heading2"/>
+        <w:pageBreakBefore/>
+      </w:pPr>
+      <w:r>
+        <w:t xml:space="preserve">Example 20: Slip 4</w:t>
+      </w:r>
+    </w:p>
+    <w:p>
+      <w:pPr>
+        <w:spacing w:after="200" w:before="200"/>
+        <w:jc w:val="center"/>
+      </w:pPr>
+      <w:r>
+        <w:rPr>
+          <w:i/>
+          <w:iCs/>
+          <w:sz w:val="40"/>
+          <w:szCs w:val="40"/>
+        </w:rPr>
+        <w:t xml:space="preserve">g(x)=−f(x)</w:t>
+      </w:r>
+    </w:p>
+    <w:p>
+      <w:pPr>
+        <w:pStyle w:val="Heading3"/>
+        <w:keepNext/>
+      </w:pPr>
+      <w:r>
+        <w:t xml:space="preserve">Question</w:t>
+      </w:r>
+    </w:p>
+    <w:p>
+      <w:pPr>
+        <w:spacing w:after="120" w:before="80" w:line="300"/>
+      </w:pPr>
+      <w:r>
+        <w:t xml:space="preserve">A student says the graph of g is the graph of f reflected across the y-axis. What is the mistake, if any?</w:t>
+      </w:r>
+    </w:p>
+    <w:p>
+      <w:pPr>
+        <w:spacing w:after="40" w:before="20"/>
+        <w:ind w:left="360"/>
+      </w:pPr>
+      <w:r>
+        <w:rPr>
+          <w:b/>
+          <w:bCs/>
+        </w:rPr>
+        <w:t xml:space="preserve">A.  </w:t>
+      </w:r>
+      <w:r>
+        <w:t xml:space="preserve">There is no mistake.</w:t>
+      </w:r>
+    </w:p>
+    <w:p>
+      <w:pPr>
+        <w:spacing w:after="40" w:before="20"/>
+        <w:ind w:left="360"/>
+      </w:pPr>
+      <w:r>
+        <w:rPr>
+          <w:b/>
+          <w:bCs/>
+        </w:rPr>
+        <w:t xml:space="preserve">B.  </w:t>
+      </w:r>
+      <w:r>
+        <w:t xml:space="preserve">A minus in front reflects across the x-axis instead.</w:t>
+      </w:r>
+    </w:p>
+    <w:p>
+      <w:pPr>
+        <w:spacing w:after="40" w:before="20"/>
+        <w:ind w:left="360"/>
+      </w:pPr>
+      <w:r>
+        <w:rPr>
+          <w:b/>
+          <w:bCs/>
+        </w:rPr>
+        <w:t xml:space="preserve">C.  </w:t>
+      </w:r>
+      <w:r>
+        <w:t xml:space="preserve">It is a shift down, because of the minus sign out front.</w:t>
+      </w:r>
+    </w:p>
+    <w:p>
+      <w:pPr>
+        <w:spacing w:after="40" w:before="20"/>
+        <w:ind w:left="360"/>
+      </w:pPr>
+      <w:r>
+        <w:rPr>
+          <w:b/>
+          <w:bCs/>
+        </w:rPr>
+        <w:t xml:space="preserve">D.  </w:t>
+      </w:r>
+      <w:r>
+        <w:t xml:space="preserve">It is a reflection across the line y = x instead.</w:t>
+      </w:r>
+    </w:p>
+    <w:p>
+      <w:pPr>
+        <w:pStyle w:val="Heading3"/>
+        <w:keepNext/>
+      </w:pPr>
+      <w:r>
+        <w:t xml:space="preserve">Answer and reasoning</w:t>
+      </w:r>
+    </w:p>
+    <w:p>
+      <w:pPr>
+        <w:spacing w:after="120" w:before="80" w:line="300"/>
+      </w:pPr>
+      <w:r>
+        <w:rPr>
+          <w:i/>
+          <w:iCs/>
+        </w:rPr>
+        <w:t xml:space="preserve">−f(x)</w:t>
+      </w:r>
+      <w:r>
+        <w:t xml:space="preserve"> keeps every </w:t>
+      </w:r>
+      <w:r>
+        <w:rPr>
+          <w:i/>
+          <w:iCs/>
+        </w:rPr>
+        <w:t xml:space="preserve">x</w:t>
+      </w:r>
+      <w:r>
+        <w:t xml:space="preserve"> and changes the sign of every </w:t>
+      </w:r>
+      <w:r>
+        <w:rPr>
+          <w:i/>
+          <w:iCs/>
+        </w:rPr>
+        <w:t xml:space="preserve">y</w:t>
+      </w:r>
+      <w:r>
+        <w:t xml:space="preserve">: </w:t>
+      </w:r>
+      <w:r>
+        <w:rPr>
+          <w:i/>
+          <w:iCs/>
+        </w:rPr>
+        <w:t xml:space="preserve">(x,y)</w:t>
+      </w:r>
+      <w:r>
+        <w:t xml:space="preserve"> goes to </w:t>
+      </w:r>
+      <w:r>
+        <w:rPr>
+          <w:i/>
+          <w:iCs/>
+        </w:rPr>
+        <w:t xml:space="preserve">(x,−y)</w:t>
+      </w:r>
+      <w:r>
+        <w:t xml:space="preserve">. That flips the graph across the </w:t>
+      </w:r>
+      <w:r>
+        <w:rPr>
+          <w:i/>
+          <w:iCs/>
+        </w:rPr>
+        <w:t xml:space="preserve">x</w:t>
+      </w:r>
+      <w:r>
+        <w:t xml:space="preserve">-axis. A reflection across the </w:t>
+      </w:r>
+      <w:r>
+        <w:rPr>
+          <w:i/>
+          <w:iCs/>
+        </w:rPr>
+        <w:t xml:space="preserve">y</w:t>
+      </w:r>
+      <w:r>
+        <w:t xml:space="preserve">-axis would be </w:t>
+      </w:r>
+      <w:r>
+        <w:rPr>
+          <w:i/>
+          <w:iCs/>
+        </w:rPr>
+        <w:t xml:space="preserve">f(−x)</w:t>
+      </w:r>
+      <w:r>
+        <w:t xml:space="preserve">, which changes the sign of </w:t>
+      </w:r>
+      <w:r>
+        <w:rPr>
+          <w:i/>
+          <w:iCs/>
+        </w:rPr>
+        <w:t xml:space="preserve">x</w:t>
+      </w:r>
+      <w:r>
+        <w:t xml:space="preserve">. For CheckIt's three shapes, which are symmetric, that would not change the graph at all. </w:t>
+      </w:r>
+      <w:r>
+        <w:rPr>
+          <w:b/>
+          <w:bCs/>
+        </w:rPr>
+        <w:t xml:space="preserve">It reflects across the x-axis.</w:t>
+      </w:r>
+    </w:p>
+    <w:p>
+      <w:pPr>
+        <w:pStyle w:val="Heading2"/>
+        <w:pageBreakBefore/>
+      </w:pPr>
+      <w:r>
+        <w:t xml:space="preserve">Example 21: Slip 5</w:t>
       </w:r>
     </w:p>
     <w:p>

</xml_diff>

<commit_message>
FN4: Beyond CheckIt tab covers vertical and horizontal stretches and compressions plus f(-x) (still 21 items); summary rows for af(x), f(ax), f(-x)
Co-Authored-By: Claude Opus 5.5 <noreply@anthropic.com>
Claude-Session: https://claude.ai/code/session_013Y8PfETWcMLvmUEpCdE8Wq
</commit_message>
<xml_diff>
--- a/support-materials/FN4/FN4_worked_examples.docx
+++ b/support-materials/FN4/FN4_worked_examples.docx
@@ -3098,7 +3098,7 @@
         <w:pageBreakBefore/>
       </w:pPr>
       <w:r>
-        <w:t xml:space="preserve">Example 13: Reflect 1</w:t>
+        <w:t xml:space="preserve">Example 13: Beyond 1</w:t>
       </w:r>
     </w:p>
     <w:p>
@@ -3110,7 +3110,7 @@
           <wp:inline distT="0" distB="0" distL="0" distR="0">
             <wp:extent cx="4457700" cy="2476500"/>
             <wp:effectExtent t="0" r="0" b="0" l="0"/>
-            <wp:docPr id="1" name="hr1" descr="The graph of f(x) = square root of x. Plotted data: The graph of f(x) = square root of x on a grid from −8 to 8 across and −4 to 4 up. It starts at the origin (0, 0) and rises to the right, more and more slowly, through (1, 1) and (4, 2). All three points are labeled. There is no graph to the left of the y-axis." title="The graph of f(x) = square root of x"/>
+            <wp:docPr id="1" name="bc1" descr="The graph of f(x) = square root of x. Plotted data: The graph of f(x) = square root of x on a grid from −8 to 8 across and −4 to 4 up. It starts at the origin (0, 0) and rises to the right, more and more slowly, through (1, 1) and (4, 2). All three points are labeled. There is no graph to the left of the y-axis." title="The graph of f(x) = square root of x"/>
             <wp:cNvGraphicFramePr>
               <a:graphicFrameLocks xmlns:a="http://schemas.openxmlformats.org/drawingml/2006/main" noChangeAspect="1"/>
             </wp:cNvGraphicFramePr>
@@ -3179,7 +3179,7 @@
           <w:sz w:val="40"/>
           <w:szCs w:val="40"/>
         </w:rPr>
-        <w:t xml:space="preserve">g(x)=f(−x)</w:t>
+        <w:t xml:space="preserve">g(x)=2f(x)</w:t>
       </w:r>
     </w:p>
     <w:p>
@@ -3212,7 +3212,7 @@
         <w:t xml:space="preserve">A.  </w:t>
       </w:r>
       <w:r>
-        <w:t xml:space="preserve">(4, −2)</w:t>
+        <w:t xml:space="preserve">(8, 2)</w:t>
       </w:r>
     </w:p>
     <w:p>
@@ -3228,7 +3228,7 @@
         <w:t xml:space="preserve">B.  </w:t>
       </w:r>
       <w:r>
-        <w:t xml:space="preserve">(−4, −2)</w:t>
+        <w:t xml:space="preserve">(4, 4)</w:t>
       </w:r>
     </w:p>
     <w:p>
@@ -3244,7 +3244,7 @@
         <w:t xml:space="preserve">C.  </w:t>
       </w:r>
       <w:r>
-        <w:t xml:space="preserve">(−4, 2)</w:t>
+        <w:t xml:space="preserve">(2, 2)</w:t>
       </w:r>
     </w:p>
     <w:p>
@@ -3260,7 +3260,7 @@
         <w:t xml:space="preserve">D.  </w:t>
       </w:r>
       <w:r>
-        <w:t xml:space="preserve">(2, 4)</w:t>
+        <w:t xml:space="preserve">(4, 1)</w:t>
       </w:r>
     </w:p>
     <w:p>
@@ -3277,51 +3277,44 @@
         <w:spacing w:after="120" w:before="80" w:line="300"/>
       </w:pPr>
       <w:r>
-        <w:rPr>
-          <w:i/>
-          <w:iCs/>
-        </w:rPr>
-        <w:t xml:space="preserve">g(−4)=f(4)=2</w:t>
-      </w:r>
-      <w:r>
-        <w:t xml:space="preserve">, because </w:t>
-      </w:r>
-      <w:r>
-        <w:rPr>
-          <w:i/>
-          <w:iCs/>
-        </w:rPr>
-        <w:t xml:space="preserve">−(−4)=4</w:t>
-      </w:r>
-      <w:r>
-        <w:t xml:space="preserve">, so </w:t>
-      </w:r>
-      <w:r>
-        <w:rPr>
-          <w:i/>
-          <w:iCs/>
-        </w:rPr>
-        <w:t xml:space="preserve">(−4,2)</w:t>
-      </w:r>
-      <w:r>
-        <w:t xml:space="preserve"> is on </w:t>
-      </w:r>
-      <w:r>
-        <w:rPr>
-          <w:i/>
-          <w:iCs/>
-        </w:rPr>
-        <w:t xml:space="preserve">g</w:t>
-      </w:r>
-      <w:r>
-        <w:t xml:space="preserve">. The input changes sign and the output stays the same: </w:t>
-      </w:r>
-      <w:r>
-        <w:rPr>
-          <w:i/>
-          <w:iCs/>
-        </w:rPr>
-        <w:t xml:space="preserve">(x,y)</w:t>
+        <w:t xml:space="preserve">The 2 is outside, so it multiplies the output: </w:t>
+      </w:r>
+      <w:r>
+        <w:rPr>
+          <w:i/>
+          <w:iCs/>
+        </w:rPr>
+        <w:t xml:space="preserve">g(4)=2f(4)=2· 2=4</w:t>
+      </w:r>
+      <w:r>
+        <w:t xml:space="preserve">. The point keeps its </w:t>
+      </w:r>
+      <w:r>
+        <w:rPr>
+          <w:i/>
+          <w:iCs/>
+        </w:rPr>
+        <w:t xml:space="preserve">x</w:t>
+      </w:r>
+      <w:r>
+        <w:t xml:space="preserve"> and doubles its </w:t>
+      </w:r>
+      <w:r>
+        <w:rPr>
+          <w:i/>
+          <w:iCs/>
+        </w:rPr>
+        <w:t xml:space="preserve">y</w:t>
+      </w:r>
+      <w:r>
+        <w:t xml:space="preserve">: </w:t>
+      </w:r>
+      <w:r>
+        <w:rPr>
+          <w:i/>
+          <w:iCs/>
+        </w:rPr>
+        <w:t xml:space="preserve">(4,2)</w:t>
       </w:r>
       <w:r>
         <w:t xml:space="preserve"> goes to </w:t>
@@ -3331,40 +3324,10 @@
           <w:i/>
           <w:iCs/>
         </w:rPr>
-        <w:t xml:space="preserve">(−x,y)</w:t>
-      </w:r>
-      <w:r>
-        <w:t xml:space="preserve">. The whole graph of </w:t>
-      </w:r>
-      <w:r>
-        <w:rPr>
-          <w:i/>
-          <w:iCs/>
-        </w:rPr>
-        <w:t xml:space="preserve">√x</w:t>
-      </w:r>
-      <w:r>
-        <w:t xml:space="preserve"> flips to the left side of the </w:t>
-      </w:r>
-      <w:r>
-        <w:rPr>
-          <w:i/>
-          <w:iCs/>
-        </w:rPr>
-        <w:t xml:space="preserve">y</w:t>
-      </w:r>
-      <w:r>
-        <w:t xml:space="preserve">-axis. The point </w:t>
-      </w:r>
-      <w:r>
-        <w:rPr>
-          <w:i/>
-          <w:iCs/>
-        </w:rPr>
-        <w:t xml:space="preserve">(4,−2)</w:t>
-      </w:r>
-      <w:r>
-        <w:t xml:space="preserve"> is the reflection across the </w:t>
+        <w:t xml:space="preserve">(4,4)</w:t>
+      </w:r>
+      <w:r>
+        <w:t xml:space="preserve">. This is a vertical stretch away from the </w:t>
       </w:r>
       <w:r>
         <w:rPr>
@@ -3374,36 +3337,56 @@
         <w:t xml:space="preserve">x</w:t>
       </w:r>
       <w:r>
-        <w:t xml:space="preserve">-axis, </w:t>
-      </w:r>
-      <w:r>
-        <w:rPr>
-          <w:i/>
-          <w:iCs/>
-        </w:rPr>
-        <w:t xml:space="preserve">−f(x)</w:t>
-      </w:r>
-      <w:r>
-        <w:t xml:space="preserve">, and </w:t>
-      </w:r>
-      <w:r>
-        <w:rPr>
-          <w:i/>
-          <w:iCs/>
-        </w:rPr>
-        <w:t xml:space="preserve">(−4,−2)</w:t>
-      </w:r>
-      <w:r>
-        <w:t xml:space="preserve"> reflects across both axes. </w:t>
-      </w:r>
-      <w:r>
-        <w:rPr>
-          <w:b/>
-          <w:bCs/>
-          <w:i/>
-          <w:iCs/>
-        </w:rPr>
-        <w:t xml:space="preserve">(−4,2)</w:t>
+        <w:t xml:space="preserve">-axis, and </w:t>
+      </w:r>
+      <w:r>
+        <w:rPr>
+          <w:i/>
+          <w:iCs/>
+        </w:rPr>
+        <w:t xml:space="preserve">(0,0)</w:t>
+      </w:r>
+      <w:r>
+        <w:t xml:space="preserve"> stays put. The answers </w:t>
+      </w:r>
+      <w:r>
+        <w:rPr>
+          <w:i/>
+          <w:iCs/>
+        </w:rPr>
+        <w:t xml:space="preserve">(8,2)</w:t>
+      </w:r>
+      <w:r>
+        <w:t xml:space="preserve"> and </w:t>
+      </w:r>
+      <w:r>
+        <w:rPr>
+          <w:i/>
+          <w:iCs/>
+        </w:rPr>
+        <w:t xml:space="preserve">(2,2)</w:t>
+      </w:r>
+      <w:r>
+        <w:t xml:space="preserve"> change the input, and </w:t>
+      </w:r>
+      <w:r>
+        <w:rPr>
+          <w:i/>
+          <w:iCs/>
+        </w:rPr>
+        <w:t xml:space="preserve">(4,1)</w:t>
+      </w:r>
+      <w:r>
+        <w:t xml:space="preserve"> halves the output instead. </w:t>
+      </w:r>
+      <w:r>
+        <w:rPr>
+          <w:b/>
+          <w:bCs/>
+          <w:i/>
+          <w:iCs/>
+        </w:rPr>
+        <w:t xml:space="preserve">(4,4)</w:t>
       </w:r>
       <w:r>
         <w:rPr>
@@ -3419,672 +3402,7 @@
         <w:pageBreakBefore/>
       </w:pPr>
       <w:r>
-        <w:t xml:space="preserve">Example 14: Reflect 2</w:t>
-      </w:r>
-    </w:p>
-    <w:p>
-      <w:pPr>
-        <w:spacing w:after="200" w:before="200"/>
-        <w:jc w:val="center"/>
-      </w:pPr>
-      <w:r>
-        <w:rPr>
-          <w:i/>
-          <w:iCs/>
-          <w:sz w:val="40"/>
-          <w:szCs w:val="40"/>
-        </w:rPr>
-        <w:t xml:space="preserve">y=f(x)</w:t>
-      </w:r>
-    </w:p>
-    <w:p>
-      <w:pPr>
-        <w:pStyle w:val="Heading3"/>
-        <w:keepNext/>
-      </w:pPr>
-      <w:r>
-        <w:t xml:space="preserve">Question</w:t>
-      </w:r>
-    </w:p>
-    <w:p>
-      <w:pPr>
-        <w:spacing w:after="120" w:before="80" w:line="300"/>
-      </w:pPr>
-      <w:r>
-        <w:t xml:space="preserve">Which formula reflects the graph of f across the y-axis?</w:t>
-      </w:r>
-    </w:p>
-    <w:p>
-      <w:pPr>
-        <w:spacing w:after="40" w:before="20"/>
-        <w:ind w:left="360"/>
-      </w:pPr>
-      <w:r>
-        <w:rPr>
-          <w:b/>
-          <w:bCs/>
-        </w:rPr>
-        <w:t xml:space="preserve">A.  </w:t>
-      </w:r>
-      <w:r>
-        <w:rPr>
-          <w:i/>
-          <w:iCs/>
-        </w:rPr>
-        <w:t xml:space="preserve">−f(x)</w:t>
-      </w:r>
-    </w:p>
-    <w:p>
-      <w:pPr>
-        <w:spacing w:after="40" w:before="20"/>
-        <w:ind w:left="360"/>
-      </w:pPr>
-      <w:r>
-        <w:rPr>
-          <w:b/>
-          <w:bCs/>
-        </w:rPr>
-        <w:t xml:space="preserve">B.  </w:t>
-      </w:r>
-      <w:r>
-        <w:rPr>
-          <w:i/>
-          <w:iCs/>
-        </w:rPr>
-        <w:t xml:space="preserve">f(−x)</w:t>
-      </w:r>
-    </w:p>
-    <w:p>
-      <w:pPr>
-        <w:spacing w:after="40" w:before="20"/>
-        <w:ind w:left="360"/>
-      </w:pPr>
-      <w:r>
-        <w:rPr>
-          <w:b/>
-          <w:bCs/>
-        </w:rPr>
-        <w:t xml:space="preserve">C.  </w:t>
-      </w:r>
-      <w:r>
-        <w:rPr>
-          <w:i/>
-          <w:iCs/>
-        </w:rPr>
-        <w:t xml:space="preserve">−f(−x)</w:t>
-      </w:r>
-    </w:p>
-    <w:p>
-      <w:pPr>
-        <w:spacing w:after="40" w:before="20"/>
-        <w:ind w:left="360"/>
-      </w:pPr>
-      <w:r>
-        <w:rPr>
-          <w:b/>
-          <w:bCs/>
-        </w:rPr>
-        <w:t xml:space="preserve">D.  </w:t>
-      </w:r>
-      <w:r>
-        <w:rPr>
-          <w:i/>
-          <w:iCs/>
-        </w:rPr>
-        <w:t xml:space="preserve">f(x)−1</w:t>
-      </w:r>
-    </w:p>
-    <w:p>
-      <w:pPr>
-        <w:pStyle w:val="Heading3"/>
-        <w:keepNext/>
-      </w:pPr>
-      <w:r>
-        <w:t xml:space="preserve">Answer and reasoning</w:t>
-      </w:r>
-    </w:p>
-    <w:p>
-      <w:pPr>
-        <w:spacing w:after="120" w:before="80" w:line="300"/>
-      </w:pPr>
-      <w:r>
-        <w:t xml:space="preserve">A reflection across the </w:t>
-      </w:r>
-      <w:r>
-        <w:rPr>
-          <w:i/>
-          <w:iCs/>
-        </w:rPr>
-        <w:t xml:space="preserve">y</w:t>
-      </w:r>
-      <w:r>
-        <w:t xml:space="preserve">-axis swaps left and right, so it changes the inputs: </w:t>
-      </w:r>
-      <w:r>
-        <w:rPr>
-          <w:i/>
-          <w:iCs/>
-        </w:rPr>
-        <w:t xml:space="preserve">f(−x)</w:t>
-      </w:r>
-      <w:r>
-        <w:t xml:space="preserve">. A minus outside, </w:t>
-      </w:r>
-      <w:r>
-        <w:rPr>
-          <w:i/>
-          <w:iCs/>
-        </w:rPr>
-        <w:t xml:space="preserve">−f(x)</w:t>
-      </w:r>
-      <w:r>
-        <w:t xml:space="preserve">, changes the outputs, which reflects across the </w:t>
-      </w:r>
-      <w:r>
-        <w:rPr>
-          <w:i/>
-          <w:iCs/>
-        </w:rPr>
-        <w:t xml:space="preserve">x</w:t>
-      </w:r>
-      <w:r>
-        <w:t xml:space="preserve">-axis. Both minus signs, </w:t>
-      </w:r>
-      <w:r>
-        <w:rPr>
-          <w:i/>
-          <w:iCs/>
-        </w:rPr>
-        <w:t xml:space="preserve">−f(−x)</w:t>
-      </w:r>
-      <w:r>
-        <w:t xml:space="preserve">, reflect across both axes. Memory hook: a minus inside changes </w:t>
-      </w:r>
-      <w:r>
-        <w:rPr>
-          <w:i/>
-          <w:iCs/>
-        </w:rPr>
-        <w:t xml:space="preserve">x</w:t>
-      </w:r>
-      <w:r>
-        <w:t xml:space="preserve">, a minus outside changes </w:t>
-      </w:r>
-      <w:r>
-        <w:rPr>
-          <w:i/>
-          <w:iCs/>
-        </w:rPr>
-        <w:t xml:space="preserve">y</w:t>
-      </w:r>
-      <w:r>
-        <w:t xml:space="preserve">. </w:t>
-      </w:r>
-      <w:r>
-        <w:rPr>
-          <w:b/>
-          <w:bCs/>
-          <w:i/>
-          <w:iCs/>
-        </w:rPr>
-        <w:t xml:space="preserve">f(−x)</w:t>
-      </w:r>
-      <w:r>
-        <w:rPr>
-          <w:b/>
-          <w:bCs/>
-        </w:rPr>
-        <w:t xml:space="preserve">.</w:t>
-      </w:r>
-    </w:p>
-    <w:p>
-      <w:pPr>
-        <w:pStyle w:val="Heading2"/>
-        <w:pageBreakBefore/>
-      </w:pPr>
-      <w:r>
-        <w:t xml:space="preserve">Example 15: Reflect 3</w:t>
-      </w:r>
-    </w:p>
-    <w:p>
-      <w:pPr>
-        <w:spacing w:after="200" w:before="200"/>
-        <w:jc w:val="center"/>
-      </w:pPr>
-      <w:r>
-        <w:rPr>
-          <w:i/>
-          <w:iCs/>
-          <w:sz w:val="40"/>
-          <w:szCs w:val="40"/>
-        </w:rPr>
-        <w:t xml:space="preserve">f(x)=x</w:t>
-      </w:r>
-      <w:r>
-        <w:rPr>
-          <w:i/>
-          <w:iCs/>
-          <w:sz w:val="40"/>
-          <w:szCs w:val="40"/>
-          <w:vertAlign w:val="superscript"/>
-        </w:rPr>
-        <w:t xml:space="preserve">2</w:t>
-      </w:r>
-      <w:r>
-        <w:rPr>
-          <w:i/>
-          <w:iCs/>
-          <w:sz w:val="40"/>
-          <w:szCs w:val="40"/>
-        </w:rPr>
-        <w:t xml:space="preserve">+3x</w:t>
-      </w:r>
-    </w:p>
-    <w:p>
-      <w:pPr>
-        <w:pStyle w:val="Heading3"/>
-        <w:keepNext/>
-      </w:pPr>
-      <w:r>
-        <w:t xml:space="preserve">Question</w:t>
-      </w:r>
-    </w:p>
-    <w:p>
-      <w:pPr>
-        <w:spacing w:after="120" w:before="80" w:line="300"/>
-      </w:pPr>
-      <w:r>
-        <w:t xml:space="preserve">What is f(−x), simplified?</w:t>
-      </w:r>
-    </w:p>
-    <w:p>
-      <w:pPr>
-        <w:spacing w:after="40" w:before="20"/>
-        <w:ind w:left="360"/>
-      </w:pPr>
-      <w:r>
-        <w:rPr>
-          <w:b/>
-          <w:bCs/>
-        </w:rPr>
-        <w:t xml:space="preserve">A.  </w:t>
-      </w:r>
-      <w:r>
-        <w:rPr>
-          <w:i/>
-          <w:iCs/>
-        </w:rPr>
-        <w:t xml:space="preserve">−x</w:t>
-      </w:r>
-      <w:r>
-        <w:rPr>
-          <w:i/>
-          <w:iCs/>
-          <w:vertAlign w:val="superscript"/>
-        </w:rPr>
-        <w:t xml:space="preserve">2</w:t>
-      </w:r>
-      <w:r>
-        <w:rPr>
-          <w:i/>
-          <w:iCs/>
-        </w:rPr>
-        <w:t xml:space="preserve">−3x</w:t>
-      </w:r>
-    </w:p>
-    <w:p>
-      <w:pPr>
-        <w:spacing w:after="40" w:before="20"/>
-        <w:ind w:left="360"/>
-      </w:pPr>
-      <w:r>
-        <w:rPr>
-          <w:b/>
-          <w:bCs/>
-        </w:rPr>
-        <w:t xml:space="preserve">B.  </w:t>
-      </w:r>
-      <w:r>
-        <w:rPr>
-          <w:i/>
-          <w:iCs/>
-        </w:rPr>
-        <w:t xml:space="preserve">−x</w:t>
-      </w:r>
-      <w:r>
-        <w:rPr>
-          <w:i/>
-          <w:iCs/>
-          <w:vertAlign w:val="superscript"/>
-        </w:rPr>
-        <w:t xml:space="preserve">2</w:t>
-      </w:r>
-      <w:r>
-        <w:rPr>
-          <w:i/>
-          <w:iCs/>
-        </w:rPr>
-        <w:t xml:space="preserve">+3x</w:t>
-      </w:r>
-    </w:p>
-    <w:p>
-      <w:pPr>
-        <w:spacing w:after="40" w:before="20"/>
-        <w:ind w:left="360"/>
-      </w:pPr>
-      <w:r>
-        <w:rPr>
-          <w:b/>
-          <w:bCs/>
-        </w:rPr>
-        <w:t xml:space="preserve">C.  </w:t>
-      </w:r>
-      <w:r>
-        <w:rPr>
-          <w:i/>
-          <w:iCs/>
-        </w:rPr>
-        <w:t xml:space="preserve">x</w:t>
-      </w:r>
-      <w:r>
-        <w:rPr>
-          <w:i/>
-          <w:iCs/>
-          <w:vertAlign w:val="superscript"/>
-        </w:rPr>
-        <w:t xml:space="preserve">2</w:t>
-      </w:r>
-      <w:r>
-        <w:rPr>
-          <w:i/>
-          <w:iCs/>
-        </w:rPr>
-        <w:t xml:space="preserve">+3x</w:t>
-      </w:r>
-    </w:p>
-    <w:p>
-      <w:pPr>
-        <w:spacing w:after="40" w:before="20"/>
-        <w:ind w:left="360"/>
-      </w:pPr>
-      <w:r>
-        <w:rPr>
-          <w:b/>
-          <w:bCs/>
-        </w:rPr>
-        <w:t xml:space="preserve">D.  </w:t>
-      </w:r>
-      <w:r>
-        <w:rPr>
-          <w:i/>
-          <w:iCs/>
-        </w:rPr>
-        <w:t xml:space="preserve">x</w:t>
-      </w:r>
-      <w:r>
-        <w:rPr>
-          <w:i/>
-          <w:iCs/>
-          <w:vertAlign w:val="superscript"/>
-        </w:rPr>
-        <w:t xml:space="preserve">2</w:t>
-      </w:r>
-      <w:r>
-        <w:rPr>
-          <w:i/>
-          <w:iCs/>
-        </w:rPr>
-        <w:t xml:space="preserve">−3x</w:t>
-      </w:r>
-    </w:p>
-    <w:p>
-      <w:pPr>
-        <w:pStyle w:val="Heading3"/>
-        <w:keepNext/>
-      </w:pPr>
-      <w:r>
-        <w:t xml:space="preserve">Answer and reasoning</w:t>
-      </w:r>
-    </w:p>
-    <w:p>
-      <w:pPr>
-        <w:spacing w:after="120" w:before="80" w:line="300"/>
-      </w:pPr>
-      <w:r>
-        <w:t xml:space="preserve">Replace every </w:t>
-      </w:r>
-      <w:r>
-        <w:rPr>
-          <w:i/>
-          <w:iCs/>
-        </w:rPr>
-        <w:t xml:space="preserve">x</w:t>
-      </w:r>
-      <w:r>
-        <w:t xml:space="preserve"> with </w:t>
-      </w:r>
-      <w:r>
-        <w:rPr>
-          <w:i/>
-          <w:iCs/>
-        </w:rPr>
-        <w:t xml:space="preserve">(−x)</w:t>
-      </w:r>
-      <w:r>
-        <w:t xml:space="preserve">, parentheses included: </w:t>
-      </w:r>
-      <w:r>
-        <w:rPr>
-          <w:i/>
-          <w:iCs/>
-        </w:rPr>
-        <w:t xml:space="preserve">f(−x)=(−x)</w:t>
-      </w:r>
-      <w:r>
-        <w:rPr>
-          <w:i/>
-          <w:iCs/>
-          <w:vertAlign w:val="superscript"/>
-        </w:rPr>
-        <w:t xml:space="preserve">2</w:t>
-      </w:r>
-      <w:r>
-        <w:rPr>
-          <w:i/>
-          <w:iCs/>
-        </w:rPr>
-        <w:t xml:space="preserve">+3(−x)=x</w:t>
-      </w:r>
-      <w:r>
-        <w:rPr>
-          <w:i/>
-          <w:iCs/>
-          <w:vertAlign w:val="superscript"/>
-        </w:rPr>
-        <w:t xml:space="preserve">2</w:t>
-      </w:r>
-      <w:r>
-        <w:rPr>
-          <w:i/>
-          <w:iCs/>
-        </w:rPr>
-        <w:t xml:space="preserve">−3x</w:t>
-      </w:r>
-      <w:r>
-        <w:t xml:space="preserve">. The square makes </w:t>
-      </w:r>
-      <w:r>
-        <w:rPr>
-          <w:i/>
-          <w:iCs/>
-        </w:rPr>
-        <w:t xml:space="preserve">(−x)</w:t>
-      </w:r>
-      <w:r>
-        <w:rPr>
-          <w:i/>
-          <w:iCs/>
-          <w:vertAlign w:val="superscript"/>
-        </w:rPr>
-        <w:t xml:space="preserve">2</w:t>
-      </w:r>
-      <w:r>
-        <w:rPr>
-          <w:i/>
-          <w:iCs/>
-        </w:rPr>
-        <w:t xml:space="preserve">=x</w:t>
-      </w:r>
-      <w:r>
-        <w:rPr>
-          <w:i/>
-          <w:iCs/>
-          <w:vertAlign w:val="superscript"/>
-        </w:rPr>
-        <w:t xml:space="preserve">2</w:t>
-      </w:r>
-      <w:r>
-        <w:t xml:space="preserve">, so only the odd-power term changes sign. The answer </w:t>
-      </w:r>
-      <w:r>
-        <w:rPr>
-          <w:i/>
-          <w:iCs/>
-        </w:rPr>
-        <w:t xml:space="preserve">−x</w:t>
-      </w:r>
-      <w:r>
-        <w:rPr>
-          <w:i/>
-          <w:iCs/>
-          <w:vertAlign w:val="superscript"/>
-        </w:rPr>
-        <w:t xml:space="preserve">2</w:t>
-      </w:r>
-      <w:r>
-        <w:rPr>
-          <w:i/>
-          <w:iCs/>
-        </w:rPr>
-        <w:t xml:space="preserve">−3x</w:t>
-      </w:r>
-      <w:r>
-        <w:t xml:space="preserve"> is </w:t>
-      </w:r>
-      <w:r>
-        <w:rPr>
-          <w:i/>
-          <w:iCs/>
-        </w:rPr>
-        <w:t xml:space="preserve">−f(x)</w:t>
-      </w:r>
-      <w:r>
-        <w:t xml:space="preserve">, which multiplies the outputs instead, and </w:t>
-      </w:r>
-      <w:r>
-        <w:rPr>
-          <w:i/>
-          <w:iCs/>
-        </w:rPr>
-        <w:t xml:space="preserve">−x</w:t>
-      </w:r>
-      <w:r>
-        <w:rPr>
-          <w:i/>
-          <w:iCs/>
-          <w:vertAlign w:val="superscript"/>
-        </w:rPr>
-        <w:t xml:space="preserve">2</w:t>
-      </w:r>
-      <w:r>
-        <w:rPr>
-          <w:i/>
-          <w:iCs/>
-        </w:rPr>
-        <w:t xml:space="preserve">+3x</w:t>
-      </w:r>
-      <w:r>
-        <w:t xml:space="preserve"> forgets the parentheses: </w:t>
-      </w:r>
-      <w:r>
-        <w:rPr>
-          <w:i/>
-          <w:iCs/>
-        </w:rPr>
-        <w:t xml:space="preserve">−x</w:t>
-      </w:r>
-      <w:r>
-        <w:rPr>
-          <w:i/>
-          <w:iCs/>
-          <w:vertAlign w:val="superscript"/>
-        </w:rPr>
-        <w:t xml:space="preserve">2</w:t>
-      </w:r>
-      <w:r>
-        <w:t xml:space="preserve"> is not </w:t>
-      </w:r>
-      <w:r>
-        <w:rPr>
-          <w:i/>
-          <w:iCs/>
-        </w:rPr>
-        <w:t xml:space="preserve">(−x)</w:t>
-      </w:r>
-      <w:r>
-        <w:rPr>
-          <w:i/>
-          <w:iCs/>
-          <w:vertAlign w:val="superscript"/>
-        </w:rPr>
-        <w:t xml:space="preserve">2</w:t>
-      </w:r>
-      <w:r>
-        <w:t xml:space="preserve">. </w:t>
-      </w:r>
-      <w:r>
-        <w:rPr>
-          <w:b/>
-          <w:bCs/>
-          <w:i/>
-          <w:iCs/>
-        </w:rPr>
-        <w:t xml:space="preserve">f(−x)=x</w:t>
-      </w:r>
-      <w:r>
-        <w:rPr>
-          <w:b/>
-          <w:bCs/>
-          <w:i/>
-          <w:iCs/>
-          <w:vertAlign w:val="superscript"/>
-        </w:rPr>
-        <w:t xml:space="preserve">2</w:t>
-      </w:r>
-      <w:r>
-        <w:rPr>
-          <w:b/>
-          <w:bCs/>
-          <w:i/>
-          <w:iCs/>
-        </w:rPr>
-        <w:t xml:space="preserve">−3x</w:t>
-      </w:r>
-      <w:r>
-        <w:rPr>
-          <w:b/>
-          <w:bCs/>
-        </w:rPr>
-        <w:t xml:space="preserve">.</w:t>
-      </w:r>
-    </w:p>
-    <w:p>
-      <w:pPr>
-        <w:pStyle w:val="Heading2"/>
-        <w:pageBreakBefore/>
-      </w:pPr>
-      <w:r>
-        <w:t xml:space="preserve">Example 16: Reflect 4</w:t>
+        <w:t xml:space="preserve">Example 14: Beyond 2</w:t>
       </w:r>
     </w:p>
     <w:p>
@@ -4096,7 +3414,7 @@
           <wp:inline distT="0" distB="0" distL="0" distR="0">
             <wp:extent cx="4457700" cy="2476500"/>
             <wp:effectExtent t="0" r="0" b="0" l="0"/>
-            <wp:docPr id="1" name="hr4" descr="The graph of f(x) = 4 − x squared on [−2, 2]. Plotted data: The graph of f(x) = 4 − x squared from x = −2 to x = 2: an arch from (−2, 0) up to its top point (0, 4) and back down to (2, 0). The points (−1, 3), (0, 4), and (1, 3) are labeled." title="The graph of f(x) = 4 − x squared on [−2, 2]"/>
+            <wp:docPr id="1" name="bc2" descr="The graph of f(x) = 4 − x squared on [−2, 2]. Plotted data: The graph of f(x) = 4 − x squared from x = −2 to x = 2: an arch from (−2, 0) up to its top point (0, 4) and back down to (2, 0). All three points are labeled." title="The graph of f(x) = 4 − x squared on [−2, 2]"/>
             <wp:cNvGraphicFramePr>
               <a:graphicFrameLocks xmlns:a="http://schemas.openxmlformats.org/drawingml/2006/main" noChangeAspect="1"/>
             </wp:cNvGraphicFramePr>
@@ -4150,7 +3468,22 @@
           <w:sz w:val="22"/>
           <w:szCs w:val="22"/>
         </w:rPr>
-        <w:t xml:space="preserve">The graph of f(x) = 4 − x squared from x = −2 to x = 2: an arch from (−2, 0) up to its top point (0, 4) and back down to (2, 0). The points (−1, 3), (0, 4), and (1, 3) are labeled.</w:t>
+        <w:t xml:space="preserve">The graph of f(x) = 4 − x squared from x = −2 to x = 2: an arch from (−2, 0) up to its top point (0, 4) and back down to (2, 0). All three points are labeled.</w:t>
+      </w:r>
+    </w:p>
+    <w:p>
+      <w:pPr>
+        <w:spacing w:after="200" w:before="200"/>
+        <w:jc w:val="center"/>
+      </w:pPr>
+      <w:r>
+        <w:rPr>
+          <w:i/>
+          <w:iCs/>
+          <w:sz w:val="40"/>
+          <w:szCs w:val="40"/>
+        </w:rPr>
+        <w:t xml:space="preserve">g(x)=1/2f(x)</w:t>
       </w:r>
     </w:p>
     <w:p>
@@ -4167,7 +3500,7 @@
         <w:spacing w:after="120" w:before="80" w:line="300"/>
       </w:pPr>
       <w:r>
-        <w:t xml:space="preserve">This is one of CheckIt's graphs. What does the graph of g(x) = f(−x) look like?</w:t>
+        <w:t xml:space="preserve">Where do the three labeled points go on the graph of g?</w:t>
       </w:r>
     </w:p>
     <w:p>
@@ -4183,7 +3516,7 @@
         <w:t xml:space="preserve">A.  </w:t>
       </w:r>
       <w:r>
-        <w:t xml:space="preserve">The same arch, upside down</w:t>
+        <w:t xml:space="preserve">(−4, 0), (0, 4), (4, 0)</w:t>
       </w:r>
     </w:p>
     <w:p>
@@ -4199,7 +3532,7 @@
         <w:t xml:space="preserve">B.  </w:t>
       </w:r>
       <w:r>
-        <w:t xml:space="preserve">Exactly the same arch</w:t>
+        <w:t xml:space="preserve">(−2, 0), (0, 8), (2, 0)</w:t>
       </w:r>
     </w:p>
     <w:p>
@@ -4215,7 +3548,7 @@
         <w:t xml:space="preserve">C.  </w:t>
       </w:r>
       <w:r>
-        <w:t xml:space="preserve">The same arch, moved left</w:t>
+        <w:t xml:space="preserve">(−1, 0), (0, 4), (1, 0)</w:t>
       </w:r>
     </w:p>
     <w:p>
@@ -4231,7 +3564,7 @@
         <w:t xml:space="preserve">D.  </w:t>
       </w:r>
       <w:r>
-        <w:t xml:space="preserve">The same arch, moved right</w:t>
+        <w:t xml:space="preserve">(−2, 0), (0, 2), (2, 0)</w:t>
       </w:r>
     </w:p>
     <w:p>
@@ -4248,7 +3581,351 @@
         <w:spacing w:after="120" w:before="80" w:line="300"/>
       </w:pPr>
       <w:r>
-        <w:t xml:space="preserve">Reflecting across the </w:t>
+        <w:t xml:space="preserve">Multiply every output by </w:t>
+      </w:r>
+      <w:r>
+        <w:rPr>
+          <w:i/>
+          <w:iCs/>
+        </w:rPr>
+        <w:t xml:space="preserve">1/2</w:t>
+      </w:r>
+      <w:r>
+        <w:t xml:space="preserve">: </w:t>
+      </w:r>
+      <w:r>
+        <w:rPr>
+          <w:i/>
+          <w:iCs/>
+        </w:rPr>
+        <w:t xml:space="preserve">(0,4)</w:t>
+      </w:r>
+      <w:r>
+        <w:t xml:space="preserve"> goes to </w:t>
+      </w:r>
+      <w:r>
+        <w:rPr>
+          <w:i/>
+          <w:iCs/>
+        </w:rPr>
+        <w:t xml:space="preserve">(0,2)</w:t>
+      </w:r>
+      <w:r>
+        <w:t xml:space="preserve">, and the endpoints stay at </w:t>
+      </w:r>
+      <w:r>
+        <w:rPr>
+          <w:i/>
+          <w:iCs/>
+        </w:rPr>
+        <w:t xml:space="preserve">(± 2,0)</w:t>
+      </w:r>
+      <w:r>
+        <w:t xml:space="preserve"> because half of 0 is 0. Since </w:t>
+      </w:r>
+      <w:r>
+        <w:rPr>
+          <w:i/>
+          <w:iCs/>
+        </w:rPr>
+        <w:t xml:space="preserve">0&lt;1/2&lt;1</w:t>
+      </w:r>
+      <w:r>
+        <w:t xml:space="preserve">, the arch is compressed toward the </w:t>
+      </w:r>
+      <w:r>
+        <w:rPr>
+          <w:i/>
+          <w:iCs/>
+        </w:rPr>
+        <w:t xml:space="preserve">x</w:t>
+      </w:r>
+      <w:r>
+        <w:t xml:space="preserve">-axis: same width, half as tall. The list with </w:t>
+      </w:r>
+      <w:r>
+        <w:rPr>
+          <w:i/>
+          <w:iCs/>
+        </w:rPr>
+        <w:t xml:space="preserve">(0,8)</w:t>
+      </w:r>
+      <w:r>
+        <w:t xml:space="preserve"> multiplies by 2, and the two lists that move the endpoints change the inputs instead, which is </w:t>
+      </w:r>
+      <w:r>
+        <w:rPr>
+          <w:i/>
+          <w:iCs/>
+        </w:rPr>
+        <w:t xml:space="preserve">f(2x)</w:t>
+      </w:r>
+      <w:r>
+        <w:t xml:space="preserve"> or </w:t>
+      </w:r>
+      <w:r>
+        <w:rPr>
+          <w:i/>
+          <w:iCs/>
+        </w:rPr>
+        <w:t xml:space="preserve">f(1/2x)</w:t>
+      </w:r>
+      <w:r>
+        <w:t xml:space="preserve">. </w:t>
+      </w:r>
+      <w:r>
+        <w:rPr>
+          <w:b/>
+          <w:bCs/>
+          <w:i/>
+          <w:iCs/>
+        </w:rPr>
+        <w:t xml:space="preserve">(−2,0), (0,2), (2,0)</w:t>
+      </w:r>
+      <w:r>
+        <w:rPr>
+          <w:b/>
+          <w:bCs/>
+        </w:rPr>
+        <w:t xml:space="preserve">.</w:t>
+      </w:r>
+    </w:p>
+    <w:p>
+      <w:pPr>
+        <w:pStyle w:val="Heading2"/>
+        <w:pageBreakBefore/>
+      </w:pPr>
+      <w:r>
+        <w:t xml:space="preserve">Example 15: Beyond 3</w:t>
+      </w:r>
+    </w:p>
+    <w:p>
+      <w:pPr>
+        <w:spacing w:after="60" w:before="60"/>
+      </w:pPr>
+      <w:r>
+        <w:drawing>
+          <wp:inline distT="0" distB="0" distL="0" distR="0">
+            <wp:extent cx="4429125" cy="2476500"/>
+            <wp:effectExtent t="0" r="0" b="0" l="0"/>
+            <wp:docPr id="1" name="bc3" descr="The graph of f(x) = square root of x. Plotted data: The graph of f(x) = square root of x on a grid from −8 to 8 across and −4 to 4 up. It starts at the origin (0, 0) and rises to the right, more and more slowly, through (1, 1) and (4, 2). All three points are labeled. There is no graph to the left of the y-axis." title="The graph of f(x) = square root of x"/>
+            <wp:cNvGraphicFramePr>
+              <a:graphicFrameLocks xmlns:a="http://schemas.openxmlformats.org/drawingml/2006/main" noChangeAspect="1"/>
+            </wp:cNvGraphicFramePr>
+            <a:graphic xmlns:a="http://schemas.openxmlformats.org/drawingml/2006/main">
+              <a:graphicData uri="http://schemas.openxmlformats.org/drawingml/2006/picture">
+                <pic:pic xmlns:pic="http://schemas.openxmlformats.org/drawingml/2006/picture">
+                  <pic:nvPicPr>
+                    <pic:cNvPr id="0" name="" descr=""/>
+                    <pic:cNvPicPr>
+                      <a:picLocks noChangeAspect="1" noChangeArrowheads="1"/>
+                    </pic:cNvPicPr>
+                  </pic:nvPicPr>
+                  <pic:blipFill>
+                    <a:blip r:embed="rId19" cstate="none"/>
+                    <a:srcRect/>
+                    <a:stretch>
+                      <a:fillRect/>
+                    </a:stretch>
+                  </pic:blipFill>
+                  <pic:spPr bwMode="auto">
+                    <a:xfrm>
+                      <a:off x="0" y="0"/>
+                      <a:ext cx="4429125" cy="2476500"/>
+                    </a:xfrm>
+                    <a:prstGeom prst="rect">
+                      <a:avLst/>
+                    </a:prstGeom>
+                  </pic:spPr>
+                </pic:pic>
+              </a:graphicData>
+            </a:graphic>
+          </wp:inline>
+        </w:drawing>
+      </w:r>
+    </w:p>
+    <w:p>
+      <w:pPr>
+        <w:spacing w:after="120" w:before="80" w:line="300"/>
+      </w:pPr>
+      <w:r>
+        <w:rPr>
+          <w:b/>
+          <w:bCs/>
+          <w:sz w:val="22"/>
+          <w:szCs w:val="22"/>
+        </w:rPr>
+        <w:t xml:space="preserve">Plotted data: </w:t>
+      </w:r>
+      <w:r>
+        <w:rPr>
+          <w:sz w:val="22"/>
+          <w:szCs w:val="22"/>
+        </w:rPr>
+        <w:t xml:space="preserve">The graph of f(x) = square root of x on a grid from −8 to 8 across and −4 to 4 up. It starts at the origin (0, 0) and rises to the right, more and more slowly, through (1, 1) and (4, 2). All three points are labeled. There is no graph to the left of the y-axis.</w:t>
+      </w:r>
+    </w:p>
+    <w:p>
+      <w:pPr>
+        <w:spacing w:after="200" w:before="200"/>
+        <w:jc w:val="center"/>
+      </w:pPr>
+      <w:r>
+        <w:rPr>
+          <w:i/>
+          <w:iCs/>
+          <w:sz w:val="40"/>
+          <w:szCs w:val="40"/>
+        </w:rPr>
+        <w:t xml:space="preserve">g(x)=f(2x)</w:t>
+      </w:r>
+    </w:p>
+    <w:p>
+      <w:pPr>
+        <w:pStyle w:val="Heading3"/>
+        <w:keepNext/>
+      </w:pPr>
+      <w:r>
+        <w:t xml:space="preserve">Question</w:t>
+      </w:r>
+    </w:p>
+    <w:p>
+      <w:pPr>
+        <w:spacing w:after="120" w:before="80" w:line="300"/>
+      </w:pPr>
+      <w:r>
+        <w:t xml:space="preserve">The point (4, 2) is on the graph of f. Which point is on the graph of g?</w:t>
+      </w:r>
+    </w:p>
+    <w:p>
+      <w:pPr>
+        <w:spacing w:after="40" w:before="20"/>
+        <w:ind w:left="360"/>
+      </w:pPr>
+      <w:r>
+        <w:rPr>
+          <w:b/>
+          <w:bCs/>
+        </w:rPr>
+        <w:t xml:space="preserve">A.  </w:t>
+      </w:r>
+      <w:r>
+        <w:t xml:space="preserve">(8, 2)</w:t>
+      </w:r>
+    </w:p>
+    <w:p>
+      <w:pPr>
+        <w:spacing w:after="40" w:before="20"/>
+        <w:ind w:left="360"/>
+      </w:pPr>
+      <w:r>
+        <w:rPr>
+          <w:b/>
+          <w:bCs/>
+        </w:rPr>
+        <w:t xml:space="preserve">B.  </w:t>
+      </w:r>
+      <w:r>
+        <w:t xml:space="preserve">(4, 4)</w:t>
+      </w:r>
+    </w:p>
+    <w:p>
+      <w:pPr>
+        <w:spacing w:after="40" w:before="20"/>
+        <w:ind w:left="360"/>
+      </w:pPr>
+      <w:r>
+        <w:rPr>
+          <w:b/>
+          <w:bCs/>
+        </w:rPr>
+        <w:t xml:space="preserve">C.  </w:t>
+      </w:r>
+      <w:r>
+        <w:t xml:space="preserve">(2, 2)</w:t>
+      </w:r>
+    </w:p>
+    <w:p>
+      <w:pPr>
+        <w:spacing w:after="40" w:before="20"/>
+        <w:ind w:left="360"/>
+      </w:pPr>
+      <w:r>
+        <w:rPr>
+          <w:b/>
+          <w:bCs/>
+        </w:rPr>
+        <w:t xml:space="preserve">D.  </w:t>
+      </w:r>
+      <w:r>
+        <w:t xml:space="preserve">(2, 4)</w:t>
+      </w:r>
+    </w:p>
+    <w:p>
+      <w:pPr>
+        <w:pStyle w:val="Heading3"/>
+        <w:keepNext/>
+      </w:pPr>
+      <w:r>
+        <w:t xml:space="preserve">Answer and reasoning</w:t>
+      </w:r>
+    </w:p>
+    <w:p>
+      <w:pPr>
+        <w:spacing w:after="120" w:before="80" w:line="300"/>
+      </w:pPr>
+      <w:r>
+        <w:t xml:space="preserve">The 2 is inside, so it acts on the input, and inside works opposite: </w:t>
+      </w:r>
+      <w:r>
+        <w:rPr>
+          <w:i/>
+          <w:iCs/>
+        </w:rPr>
+        <w:t xml:space="preserve">g(2)=f(2· 2)=f(4)=2</w:t>
+      </w:r>
+      <w:r>
+        <w:t xml:space="preserve">. So </w:t>
+      </w:r>
+      <w:r>
+        <w:rPr>
+          <w:i/>
+          <w:iCs/>
+        </w:rPr>
+        <w:t xml:space="preserve">g</w:t>
+      </w:r>
+      <w:r>
+        <w:t xml:space="preserve"> reaches height 2 already at </w:t>
+      </w:r>
+      <w:r>
+        <w:rPr>
+          <w:i/>
+          <w:iCs/>
+        </w:rPr>
+        <w:t xml:space="preserve">x=2</w:t>
+      </w:r>
+      <w:r>
+        <w:t xml:space="preserve">: </w:t>
+      </w:r>
+      <w:r>
+        <w:rPr>
+          <w:i/>
+          <w:iCs/>
+        </w:rPr>
+        <w:t xml:space="preserve">(4,2)</w:t>
+      </w:r>
+      <w:r>
+        <w:t xml:space="preserve"> goes to </w:t>
+      </w:r>
+      <w:r>
+        <w:rPr>
+          <w:i/>
+          <w:iCs/>
+        </w:rPr>
+        <w:t xml:space="preserve">(2,2)</w:t>
+      </w:r>
+      <w:r>
+        <w:t xml:space="preserve">. The inputs are divided by 2, which compresses the graph toward the </w:t>
       </w:r>
       <w:r>
         <w:rPr>
@@ -4258,97 +3935,348 @@
         <w:t xml:space="preserve">y</w:t>
       </w:r>
       <w:r>
-        <w:t xml:space="preserve">-axis sends </w:t>
-      </w:r>
-      <w:r>
-        <w:rPr>
-          <w:i/>
-          <w:iCs/>
-        </w:rPr>
-        <w:t xml:space="preserve">(1,3)</w:t>
-      </w:r>
-      <w:r>
-        <w:t xml:space="preserve"> to </w:t>
-      </w:r>
-      <w:r>
-        <w:rPr>
-          <w:i/>
-          <w:iCs/>
-        </w:rPr>
-        <w:t xml:space="preserve">(−1,3)</w:t>
-      </w:r>
-      <w:r>
-        <w:t xml:space="preserve"> and </w:t>
-      </w:r>
-      <w:r>
-        <w:rPr>
-          <w:i/>
-          <w:iCs/>
-        </w:rPr>
-        <w:t xml:space="preserve">(−1,3)</w:t>
-      </w:r>
-      <w:r>
-        <w:t xml:space="preserve"> to </w:t>
-      </w:r>
-      <w:r>
-        <w:rPr>
-          <w:i/>
-          <w:iCs/>
-        </w:rPr>
-        <w:t xml:space="preserve">(1,3)</w:t>
-      </w:r>
-      <w:r>
-        <w:t xml:space="preserve">: those points were already mirror images, so the graph lands on itself. Algebraically, </w:t>
-      </w:r>
-      <w:r>
-        <w:rPr>
-          <w:i/>
-          <w:iCs/>
-        </w:rPr>
-        <w:t xml:space="preserve">f(−x)=4−(−x)</w:t>
-      </w:r>
-      <w:r>
-        <w:rPr>
-          <w:i/>
-          <w:iCs/>
-          <w:vertAlign w:val="superscript"/>
-        </w:rPr>
-        <w:t xml:space="preserve">2</w:t>
-      </w:r>
-      <w:r>
-        <w:rPr>
-          <w:i/>
-          <w:iCs/>
-        </w:rPr>
-        <w:t xml:space="preserve">=4−x</w:t>
-      </w:r>
-      <w:r>
-        <w:rPr>
-          <w:i/>
-          <w:iCs/>
-          <w:vertAlign w:val="superscript"/>
-        </w:rPr>
-        <w:t xml:space="preserve">2</w:t>
-      </w:r>
-      <w:r>
-        <w:rPr>
-          <w:i/>
-          <w:iCs/>
-        </w:rPr>
-        <w:t xml:space="preserve">=f(x)</w:t>
-      </w:r>
-      <w:r>
-        <w:t xml:space="preserve">. This is true for all three CheckIt shapes, so with them, </w:t>
-      </w:r>
-      <w:r>
-        <w:rPr>
-          <w:i/>
-          <w:iCs/>
-        </w:rPr>
-        <w:t xml:space="preserve">f(−x)</w:t>
-      </w:r>
-      <w:r>
-        <w:t xml:space="preserve"> would not change anything. Upside down would be </w:t>
+        <w:t xml:space="preserve">-axis. The answer </w:t>
+      </w:r>
+      <w:r>
+        <w:rPr>
+          <w:i/>
+          <w:iCs/>
+        </w:rPr>
+        <w:t xml:space="preserve">(8,2)</w:t>
+      </w:r>
+      <w:r>
+        <w:t xml:space="preserve"> multiplies the input, the most common slip; </w:t>
+      </w:r>
+      <w:r>
+        <w:rPr>
+          <w:i/>
+          <w:iCs/>
+        </w:rPr>
+        <w:t xml:space="preserve">(4,4)</w:t>
+      </w:r>
+      <w:r>
+        <w:t xml:space="preserve"> is </w:t>
+      </w:r>
+      <w:r>
+        <w:rPr>
+          <w:i/>
+          <w:iCs/>
+        </w:rPr>
+        <w:t xml:space="preserve">2f(x)</w:t>
+      </w:r>
+      <w:r>
+        <w:t xml:space="preserve">; and </w:t>
+      </w:r>
+      <w:r>
+        <w:rPr>
+          <w:i/>
+          <w:iCs/>
+        </w:rPr>
+        <w:t xml:space="preserve">(2,4)</w:t>
+      </w:r>
+      <w:r>
+        <w:t xml:space="preserve"> does both. </w:t>
+      </w:r>
+      <w:r>
+        <w:rPr>
+          <w:b/>
+          <w:bCs/>
+          <w:i/>
+          <w:iCs/>
+        </w:rPr>
+        <w:t xml:space="preserve">(2,2)</w:t>
+      </w:r>
+      <w:r>
+        <w:rPr>
+          <w:b/>
+          <w:bCs/>
+        </w:rPr>
+        <w:t xml:space="preserve">.</w:t>
+      </w:r>
+    </w:p>
+    <w:p>
+      <w:pPr>
+        <w:pStyle w:val="Heading2"/>
+        <w:pageBreakBefore/>
+      </w:pPr>
+      <w:r>
+        <w:t xml:space="preserve">Example 16: Beyond 4</w:t>
+      </w:r>
+    </w:p>
+    <w:p>
+      <w:pPr>
+        <w:spacing w:after="60" w:before="60"/>
+      </w:pPr>
+      <w:r>
+        <w:drawing>
+          <wp:inline distT="0" distB="0" distL="0" distR="0">
+            <wp:extent cx="4457700" cy="2476500"/>
+            <wp:effectExtent t="0" r="0" b="0" l="0"/>
+            <wp:docPr id="1" name="bc4" descr="The graph of f(x) = square root of x. Plotted data: The graph of f(x) = square root of x on a grid from −8 to 8 across and −4 to 4 up. It starts at the origin (0, 0) and rises to the right, more and more slowly, through (1, 1) and (4, 2). All three points are labeled. There is no graph to the left of the y-axis." title="The graph of f(x) = square root of x"/>
+            <wp:cNvGraphicFramePr>
+              <a:graphicFrameLocks xmlns:a="http://schemas.openxmlformats.org/drawingml/2006/main" noChangeAspect="1"/>
+            </wp:cNvGraphicFramePr>
+            <a:graphic xmlns:a="http://schemas.openxmlformats.org/drawingml/2006/main">
+              <a:graphicData uri="http://schemas.openxmlformats.org/drawingml/2006/picture">
+                <pic:pic xmlns:pic="http://schemas.openxmlformats.org/drawingml/2006/picture">
+                  <pic:nvPicPr>
+                    <pic:cNvPr id="0" name="" descr=""/>
+                    <pic:cNvPicPr>
+                      <a:picLocks noChangeAspect="1" noChangeArrowheads="1"/>
+                    </pic:cNvPicPr>
+                  </pic:nvPicPr>
+                  <pic:blipFill>
+                    <a:blip r:embed="rId20" cstate="none"/>
+                    <a:srcRect/>
+                    <a:stretch>
+                      <a:fillRect/>
+                    </a:stretch>
+                  </pic:blipFill>
+                  <pic:spPr bwMode="auto">
+                    <a:xfrm>
+                      <a:off x="0" y="0"/>
+                      <a:ext cx="4457700" cy="2476500"/>
+                    </a:xfrm>
+                    <a:prstGeom prst="rect">
+                      <a:avLst/>
+                    </a:prstGeom>
+                  </pic:spPr>
+                </pic:pic>
+              </a:graphicData>
+            </a:graphic>
+          </wp:inline>
+        </w:drawing>
+      </w:r>
+    </w:p>
+    <w:p>
+      <w:pPr>
+        <w:spacing w:after="120" w:before="80" w:line="300"/>
+      </w:pPr>
+      <w:r>
+        <w:rPr>
+          <w:b/>
+          <w:bCs/>
+          <w:sz w:val="22"/>
+          <w:szCs w:val="22"/>
+        </w:rPr>
+        <w:t xml:space="preserve">Plotted data: </w:t>
+      </w:r>
+      <w:r>
+        <w:rPr>
+          <w:sz w:val="22"/>
+          <w:szCs w:val="22"/>
+        </w:rPr>
+        <w:t xml:space="preserve">The graph of f(x) = square root of x on a grid from −8 to 8 across and −4 to 4 up. It starts at the origin (0, 0) and rises to the right, more and more slowly, through (1, 1) and (4, 2). All three points are labeled. There is no graph to the left of the y-axis.</w:t>
+      </w:r>
+    </w:p>
+    <w:p>
+      <w:pPr>
+        <w:spacing w:after="200" w:before="200"/>
+        <w:jc w:val="center"/>
+      </w:pPr>
+      <w:r>
+        <w:rPr>
+          <w:i/>
+          <w:iCs/>
+          <w:sz w:val="40"/>
+          <w:szCs w:val="40"/>
+        </w:rPr>
+        <w:t xml:space="preserve">g(x)=f(−x)</w:t>
+      </w:r>
+    </w:p>
+    <w:p>
+      <w:pPr>
+        <w:pStyle w:val="Heading3"/>
+        <w:keepNext/>
+      </w:pPr>
+      <w:r>
+        <w:t xml:space="preserve">Question</w:t>
+      </w:r>
+    </w:p>
+    <w:p>
+      <w:pPr>
+        <w:spacing w:after="120" w:before="80" w:line="300"/>
+      </w:pPr>
+      <w:r>
+        <w:t xml:space="preserve">The point (4, 2) is on the graph of f. Which point is on the graph of g?</w:t>
+      </w:r>
+    </w:p>
+    <w:p>
+      <w:pPr>
+        <w:spacing w:after="40" w:before="20"/>
+        <w:ind w:left="360"/>
+      </w:pPr>
+      <w:r>
+        <w:rPr>
+          <w:b/>
+          <w:bCs/>
+        </w:rPr>
+        <w:t xml:space="preserve">A.  </w:t>
+      </w:r>
+      <w:r>
+        <w:t xml:space="preserve">(−4, 2)</w:t>
+      </w:r>
+    </w:p>
+    <w:p>
+      <w:pPr>
+        <w:spacing w:after="40" w:before="20"/>
+        <w:ind w:left="360"/>
+      </w:pPr>
+      <w:r>
+        <w:rPr>
+          <w:b/>
+          <w:bCs/>
+        </w:rPr>
+        <w:t xml:space="preserve">B.  </w:t>
+      </w:r>
+      <w:r>
+        <w:t xml:space="preserve">(−4, −2)</w:t>
+      </w:r>
+    </w:p>
+    <w:p>
+      <w:pPr>
+        <w:spacing w:after="40" w:before="20"/>
+        <w:ind w:left="360"/>
+      </w:pPr>
+      <w:r>
+        <w:rPr>
+          <w:b/>
+          <w:bCs/>
+        </w:rPr>
+        <w:t xml:space="preserve">C.  </w:t>
+      </w:r>
+      <w:r>
+        <w:t xml:space="preserve">(4, −2)</w:t>
+      </w:r>
+    </w:p>
+    <w:p>
+      <w:pPr>
+        <w:spacing w:after="40" w:before="20"/>
+        <w:ind w:left="360"/>
+      </w:pPr>
+      <w:r>
+        <w:rPr>
+          <w:b/>
+          <w:bCs/>
+        </w:rPr>
+        <w:t xml:space="preserve">D.  </w:t>
+      </w:r>
+      <w:r>
+        <w:t xml:space="preserve">(2, −4)</w:t>
+      </w:r>
+    </w:p>
+    <w:p>
+      <w:pPr>
+        <w:pStyle w:val="Heading3"/>
+        <w:keepNext/>
+      </w:pPr>
+      <w:r>
+        <w:t xml:space="preserve">Answer and reasoning</w:t>
+      </w:r>
+    </w:p>
+    <w:p>
+      <w:pPr>
+        <w:spacing w:after="120" w:before="80" w:line="300"/>
+      </w:pPr>
+      <w:r>
+        <w:rPr>
+          <w:i/>
+          <w:iCs/>
+        </w:rPr>
+        <w:t xml:space="preserve">g(−4)=f(4)=2</w:t>
+      </w:r>
+      <w:r>
+        <w:t xml:space="preserve">, because </w:t>
+      </w:r>
+      <w:r>
+        <w:rPr>
+          <w:i/>
+          <w:iCs/>
+        </w:rPr>
+        <w:t xml:space="preserve">−(−4)=4</w:t>
+      </w:r>
+      <w:r>
+        <w:t xml:space="preserve">, so </w:t>
+      </w:r>
+      <w:r>
+        <w:rPr>
+          <w:i/>
+          <w:iCs/>
+        </w:rPr>
+        <w:t xml:space="preserve">(−4,2)</w:t>
+      </w:r>
+      <w:r>
+        <w:t xml:space="preserve"> is on </w:t>
+      </w:r>
+      <w:r>
+        <w:rPr>
+          <w:i/>
+          <w:iCs/>
+        </w:rPr>
+        <w:t xml:space="preserve">g</w:t>
+      </w:r>
+      <w:r>
+        <w:t xml:space="preserve">. The input changes sign and the output stays the same: </w:t>
+      </w:r>
+      <w:r>
+        <w:rPr>
+          <w:i/>
+          <w:iCs/>
+        </w:rPr>
+        <w:t xml:space="preserve">(x,y)</w:t>
+      </w:r>
+      <w:r>
+        <w:t xml:space="preserve"> goes to </w:t>
+      </w:r>
+      <w:r>
+        <w:rPr>
+          <w:i/>
+          <w:iCs/>
+        </w:rPr>
+        <w:t xml:space="preserve">(−x,y)</w:t>
+      </w:r>
+      <w:r>
+        <w:t xml:space="preserve">, a reflection across the </w:t>
+      </w:r>
+      <w:r>
+        <w:rPr>
+          <w:i/>
+          <w:iCs/>
+        </w:rPr>
+        <w:t xml:space="preserve">y</w:t>
+      </w:r>
+      <w:r>
+        <w:t xml:space="preserve">-axis. The whole graph of </w:t>
+      </w:r>
+      <w:r>
+        <w:rPr>
+          <w:i/>
+          <w:iCs/>
+        </w:rPr>
+        <w:t xml:space="preserve">√x</w:t>
+      </w:r>
+      <w:r>
+        <w:t xml:space="preserve"> flips to the left side. The point </w:t>
+      </w:r>
+      <w:r>
+        <w:rPr>
+          <w:i/>
+          <w:iCs/>
+        </w:rPr>
+        <w:t xml:space="preserve">(4,−2)</w:t>
+      </w:r>
+      <w:r>
+        <w:t xml:space="preserve"> is the reflection across the </w:t>
+      </w:r>
+      <w:r>
+        <w:rPr>
+          <w:i/>
+          <w:iCs/>
+        </w:rPr>
+        <w:t xml:space="preserve">x</w:t>
+      </w:r>
+      <w:r>
+        <w:t xml:space="preserve">-axis, </w:t>
       </w:r>
       <w:r>
         <w:rPr>
@@ -4358,26 +4286,32 @@
         <w:t xml:space="preserve">−f(x)</w:t>
       </w:r>
       <w:r>
-        <w:t xml:space="preserve">. </w:t>
-      </w:r>
-      <w:r>
-        <w:rPr>
-          <w:b/>
-          <w:bCs/>
-        </w:rPr>
-        <w:t xml:space="preserve">Exactly the same arch.</w:t>
-      </w:r>
-      <w:r>
-        <w:t xml:space="preserve"> On the homework, watch for graphs that are not symmetric, like </w:t>
-      </w:r>
-      <w:r>
-        <w:rPr>
-          <w:i/>
-          <w:iCs/>
-        </w:rPr>
-        <w:t xml:space="preserve">√x</w:t>
-      </w:r>
-      <w:r>
+        <w:t xml:space="preserve">, and </w:t>
+      </w:r>
+      <w:r>
+        <w:rPr>
+          <w:i/>
+          <w:iCs/>
+        </w:rPr>
+        <w:t xml:space="preserve">(−4,−2)</w:t>
+      </w:r>
+      <w:r>
+        <w:t xml:space="preserve"> reflects across both axes. </w:t>
+      </w:r>
+      <w:r>
+        <w:rPr>
+          <w:b/>
+          <w:bCs/>
+          <w:i/>
+          <w:iCs/>
+        </w:rPr>
+        <w:t xml:space="preserve">(−4,2)</w:t>
+      </w:r>
+      <w:r>
+        <w:rPr>
+          <w:b/>
+          <w:bCs/>
+        </w:rPr>
         <w:t xml:space="preserve">.</w:t>
       </w:r>
     </w:p>

</xml_diff>

<commit_message>
FN4: re-audit against the current rules (positions, distractor origins, slip format, Match captions collapsed, generator coverage: g/h names, upside-down parents, double reflection; Quick Summary wording; no negative-zero labels); regenerate docs and quiz
Co-Authored-By: Claude Opus 5.5 <noreply@anthropic.com>
Claude-Session: https://claude.ai/code/session_013Y8PfETWcMLvmUEpCdE8Wq
</commit_message>
<xml_diff>
--- a/support-materials/FN4/FN4_worked_examples.docx
+++ b/support-materials/FN4/FN4_worked_examples.docx
@@ -232,7 +232,7 @@
         <w:t xml:space="preserve">+3</w:t>
       </w:r>
       <w:r>
-        <w:t xml:space="preserve"> shifts it up 3, the same way as the sign. Reading the inside sign at face value gives "left 2", and the 2 and 3 are not interchangeable. </w:t>
+        <w:t xml:space="preserve"> shifts it up 3, the same way as the sign. Reading the inside sign at face value gives "left 2"; reading both signs backwards gives "left 2, then down 3"; and the 2 and 3 are not interchangeable. </w:t>
       </w:r>
       <w:r>
         <w:rPr>
@@ -418,7 +418,17 @@
         <w:t xml:space="preserve">−(f(x+4)−1)=−f(x+4)+1</w:t>
       </w:r>
       <w:r>
-        <w:t xml:space="preserve">. A reflection across the </w:t>
+        <w:t xml:space="preserve">. Reading </w:t>
+      </w:r>
+      <w:r>
+        <w:rPr>
+          <w:i/>
+          <w:iCs/>
+        </w:rPr>
+        <w:t xml:space="preserve">x+4</w:t>
+      </w:r>
+      <w:r>
+        <w:t xml:space="preserve"> at face value gives "right 4", and a reflection across the </w:t>
       </w:r>
       <w:r>
         <w:rPr>
@@ -655,7 +665,7 @@
           <w:sz w:val="40"/>
           <w:szCs w:val="40"/>
         </w:rPr>
-        <w:t xml:space="preserve">g(x)=f(x+5)−4</w:t>
+        <w:t xml:space="preserve">f(x)=−h(x−3)+2</w:t>
       </w:r>
     </w:p>
     <w:p>
@@ -672,7 +682,7 @@
         <w:spacing w:after="120" w:before="80" w:line="300"/>
       </w:pPr>
       <w:r>
-        <w:t xml:space="preserve">The point (0, 4) is on the graph of f. Which point is on the graph of g?</w:t>
+        <w:t xml:space="preserve">This time the original graph is h, and the new one is f. How is the graph of f related to the graph of h, in order?</w:t>
       </w:r>
     </w:p>
     <w:p>
@@ -688,7 +698,7 @@
         <w:t xml:space="preserve">A.  </w:t>
       </w:r>
       <w:r>
-        <w:t xml:space="preserve">(5, 0)</w:t>
+        <w:t xml:space="preserve">Shift left 3, reflect across the x-axis, then shift down 2</w:t>
       </w:r>
     </w:p>
     <w:p>
@@ -704,7 +714,7 @@
         <w:t xml:space="preserve">B.  </w:t>
       </w:r>
       <w:r>
-        <w:t xml:space="preserve">(−5, 0)</w:t>
+        <w:t xml:space="preserve">Shift left 3, reflect across the x-axis, then shift up 2</w:t>
       </w:r>
     </w:p>
     <w:p>
@@ -720,7 +730,7 @@
         <w:t xml:space="preserve">C.  </w:t>
       </w:r>
       <w:r>
-        <w:t xml:space="preserve">(−5, 8)</w:t>
+        <w:t xml:space="preserve">Shift right 3, reflect across the x-axis, then shift up 2</w:t>
       </w:r>
     </w:p>
     <w:p>
@@ -736,7 +746,7 @@
         <w:t xml:space="preserve">D.  </w:t>
       </w:r>
       <w:r>
-        <w:t xml:space="preserve">(5, 8)</w:t>
+        <w:t xml:space="preserve">Shift right 3, shift up 2, then reflect across the x-axis</w:t>
       </w:r>
     </w:p>
     <w:p>
@@ -753,90 +763,54 @@
         <w:spacing w:after="120" w:before="80" w:line="300"/>
       </w:pPr>
       <w:r>
-        <w:rPr>
-          <w:i/>
-          <w:iCs/>
-        </w:rPr>
-        <w:t xml:space="preserve">x+5</w:t>
-      </w:r>
-      <w:r>
-        <w:t xml:space="preserve"> moves every point left 5, so </w:t>
-      </w:r>
-      <w:r>
-        <w:rPr>
-          <w:i/>
-          <w:iCs/>
-        </w:rPr>
-        <w:t xml:space="preserve">x=0</w:t>
-      </w:r>
-      <w:r>
-        <w:t xml:space="preserve"> becomes </w:t>
-      </w:r>
-      <w:r>
-        <w:rPr>
-          <w:i/>
-          <w:iCs/>
-        </w:rPr>
-        <w:t xml:space="preserve">x=−5</w:t>
-      </w:r>
-      <w:r>
-        <w:t xml:space="preserve">. Then </w:t>
-      </w:r>
-      <w:r>
-        <w:rPr>
-          <w:i/>
-          <w:iCs/>
-        </w:rPr>
-        <w:t xml:space="preserve">−4</w:t>
-      </w:r>
-      <w:r>
-        <w:t xml:space="preserve"> moves it down 4, so </w:t>
-      </w:r>
-      <w:r>
-        <w:rPr>
-          <w:i/>
-          <w:iCs/>
-        </w:rPr>
-        <w:t xml:space="preserve">y=4</w:t>
-      </w:r>
-      <w:r>
-        <w:t xml:space="preserve"> becomes </w:t>
-      </w:r>
-      <w:r>
-        <w:rPr>
-          <w:i/>
-          <w:iCs/>
-        </w:rPr>
-        <w:t xml:space="preserve">y=0</w:t>
-      </w:r>
-      <w:r>
-        <w:t xml:space="preserve">. Check: </w:t>
-      </w:r>
-      <w:r>
-        <w:rPr>
-          <w:i/>
-          <w:iCs/>
-        </w:rPr>
-        <w:t xml:space="preserve">g(−5)=f(−5+5)−4=f(0)−4=4−4=0</w:t>
-      </w:r>
-      <w:r>
-        <w:t xml:space="preserve">. The other points move right or up instead. </w:t>
-      </w:r>
-      <w:r>
-        <w:rPr>
-          <w:b/>
-          <w:bCs/>
-          <w:i/>
-          <w:iCs/>
-        </w:rPr>
-        <w:t xml:space="preserve">(−5,0)</w:t>
-      </w:r>
-      <w:r>
-        <w:rPr>
-          <w:b/>
-          <w:bCs/>
-        </w:rPr>
-        <w:t xml:space="preserve">.</w:t>
+        <w:t xml:space="preserve">The letters change, but the reading does not: the function inside is the original. </w:t>
+      </w:r>
+      <w:r>
+        <w:rPr>
+          <w:i/>
+          <w:iCs/>
+        </w:rPr>
+        <w:t xml:space="preserve">x−3</w:t>
+      </w:r>
+      <w:r>
+        <w:t xml:space="preserve"> shifts right 3, the minus in front reflects across the </w:t>
+      </w:r>
+      <w:r>
+        <w:rPr>
+          <w:i/>
+          <w:iCs/>
+        </w:rPr>
+        <w:t xml:space="preserve">x</w:t>
+      </w:r>
+      <w:r>
+        <w:t xml:space="preserve">-axis, and </w:t>
+      </w:r>
+      <w:r>
+        <w:rPr>
+          <w:i/>
+          <w:iCs/>
+        </w:rPr>
+        <w:t xml:space="preserve">+2</w:t>
+      </w:r>
+      <w:r>
+        <w:t xml:space="preserve"> shifts up 2, last. "Left 3 ... down 2" reverses the direction of both shifts; "left 3 ... up 2" reads the inside sign at face value; and shifting up before reflecting would give </w:t>
+      </w:r>
+      <w:r>
+        <w:rPr>
+          <w:i/>
+          <w:iCs/>
+        </w:rPr>
+        <w:t xml:space="preserve">−(h(x−3)+2)=−h(x−3)−2</w:t>
+      </w:r>
+      <w:r>
+        <w:t xml:space="preserve">, 4 lower. </w:t>
+      </w:r>
+      <w:r>
+        <w:rPr>
+          <w:b/>
+          <w:bCs/>
+        </w:rPr>
+        <w:t xml:space="preserve">Right 3, reflect across the x-axis, then up 2.</w:t>
       </w:r>
     </w:p>
     <w:p>
@@ -857,7 +831,7 @@
           <wp:inline distT="0" distB="0" distL="0" distR="0">
             <wp:extent cx="2524125" cy="2476500"/>
             <wp:effectExtent t="0" r="0" b="0" l="0"/>
-            <wp:docPr id="1" name="tp1" descr="The graph of f, a parabola piece from x = −2 to x = 2. Plotted data: The graph of f on a grid from −8 to 8 in both directions. It is an arch of the parabola y = 4 − x squared, drawn only from x = −2 to x = 2. It starts at the point (−2, 0), rises to its top point (0, 4), and comes back down to (2, 0). All three points are labeled." title="The graph of f, a parabola piece from x = −2 to x = 2"/>
+            <wp:docPr id="1" name="tp1" descr="The graph of f, a lower semicircle from x = −2 to x = 2. Plotted data: The graph of f on a grid from −8 to 8 in both directions. It is the bottom half of a circle of radius 2 centered at the origin. It starts at (−2, 0), goes down to its lowest point (0, −2), and comes back up to (2, 0). All three points are labeled." title="The graph of f, a lower semicircle from x = −2 to x = 2"/>
             <wp:cNvGraphicFramePr>
               <a:graphicFrameLocks xmlns:a="http://schemas.openxmlformats.org/drawingml/2006/main" noChangeAspect="1"/>
             </wp:cNvGraphicFramePr>
@@ -911,7 +885,7 @@
           <w:sz w:val="22"/>
           <w:szCs w:val="22"/>
         </w:rPr>
-        <w:t xml:space="preserve">The graph of f on a grid from −8 to 8 in both directions. It is an arch of the parabola y = 4 − x squared, drawn only from x = −2 to x = 2. It starts at the point (−2, 0), rises to its top point (0, 4), and comes back down to (2, 0). All three points are labeled.</w:t>
+        <w:t xml:space="preserve">The graph of f on a grid from −8 to 8 in both directions. It is the bottom half of a circle of radius 2 centered at the origin. It starts at (−2, 0), goes down to its lowest point (0, −2), and comes back up to (2, 0). All three points are labeled.</w:t>
       </w:r>
     </w:p>
     <w:p>
@@ -926,7 +900,7 @@
           <w:sz w:val="40"/>
           <w:szCs w:val="40"/>
         </w:rPr>
-        <w:t xml:space="preserve">g(x)=f(x−3)+1</w:t>
+        <w:t xml:space="preserve">g(x)=−f(x+2)−1</w:t>
       </w:r>
     </w:p>
     <w:p>
@@ -943,7 +917,7 @@
         <w:spacing w:after="120" w:before="80" w:line="300"/>
       </w:pPr>
       <w:r>
-        <w:t xml:space="preserve">Where does the top point (0, 4) of f end up on the graph of g?</w:t>
+        <w:t xml:space="preserve">Where do the three labeled points go on the graph of g?</w:t>
       </w:r>
     </w:p>
     <w:p>
@@ -959,7 +933,7 @@
         <w:t xml:space="preserve">A.  </w:t>
       </w:r>
       <w:r>
-        <w:t xml:space="preserve">(3, 5)</w:t>
+        <w:t xml:space="preserve">(−4, −1), (−2, −3), (0, −1)</w:t>
       </w:r>
     </w:p>
     <w:p>
@@ -975,7 +949,7 @@
         <w:t xml:space="preserve">B.  </w:t>
       </w:r>
       <w:r>
-        <w:t xml:space="preserve">(−3, 5)</w:t>
+        <w:t xml:space="preserve">(−4, −1), (−2, 1), (0, −1)</w:t>
       </w:r>
     </w:p>
     <w:p>
@@ -991,7 +965,7 @@
         <w:t xml:space="preserve">C.  </w:t>
       </w:r>
       <w:r>
-        <w:t xml:space="preserve">(3, 3)</w:t>
+        <w:t xml:space="preserve">(0, −1), (2, 1), (4, −1)</w:t>
       </w:r>
     </w:p>
     <w:p>
@@ -1007,7 +981,7 @@
         <w:t xml:space="preserve">D.  </w:t>
       </w:r>
       <w:r>
-        <w:t xml:space="preserve">(−3, 3)</w:t>
+        <w:t xml:space="preserve">(−4, 1), (−2, 3), (0, 1)</w:t>
       </w:r>
     </w:p>
     <w:p>
@@ -1024,93 +998,116 @@
         <w:spacing w:after="120" w:before="80" w:line="300"/>
       </w:pPr>
       <w:r>
-        <w:rPr>
-          <w:i/>
-          <w:iCs/>
-        </w:rPr>
-        <w:t xml:space="preserve">x−3</w:t>
-      </w:r>
-      <w:r>
-        <w:t xml:space="preserve"> moves the point right 3, to </w:t>
-      </w:r>
-      <w:r>
-        <w:rPr>
-          <w:i/>
-          <w:iCs/>
-        </w:rPr>
-        <w:t xml:space="preserve">(3,4)</w:t>
-      </w:r>
-      <w:r>
-        <w:t xml:space="preserve">. Then </w:t>
-      </w:r>
-      <w:r>
-        <w:rPr>
-          <w:i/>
-          <w:iCs/>
-        </w:rPr>
-        <w:t xml:space="preserve">+1</w:t>
-      </w:r>
-      <w:r>
-        <w:t xml:space="preserve"> moves it up 1, to </w:t>
-      </w:r>
-      <w:r>
-        <w:rPr>
-          <w:i/>
-          <w:iCs/>
-        </w:rPr>
-        <w:t xml:space="preserve">(3,5)</w:t>
-      </w:r>
-      <w:r>
-        <w:t xml:space="preserve">. The endpoints go along: </w:t>
-      </w:r>
-      <w:r>
-        <w:rPr>
-          <w:i/>
-          <w:iCs/>
-        </w:rPr>
-        <w:t xml:space="preserve">(−2,0)</w:t>
-      </w:r>
-      <w:r>
-        <w:t xml:space="preserve"> goes to </w:t>
-      </w:r>
-      <w:r>
-        <w:rPr>
-          <w:i/>
-          <w:iCs/>
-        </w:rPr>
-        <w:t xml:space="preserve">(1,1)</w:t>
-      </w:r>
-      <w:r>
-        <w:t xml:space="preserve"> and </w:t>
-      </w:r>
-      <w:r>
-        <w:rPr>
-          <w:i/>
-          <w:iCs/>
-        </w:rPr>
-        <w:t xml:space="preserve">(2,0)</w:t>
-      </w:r>
-      <w:r>
-        <w:t xml:space="preserve"> goes to </w:t>
-      </w:r>
-      <w:r>
-        <w:rPr>
-          <w:i/>
-          <w:iCs/>
-        </w:rPr>
-        <w:t xml:space="preserve">(5,1)</w:t>
-      </w:r>
-      <w:r>
-        <w:t xml:space="preserve">. Sketch those three points and draw the same arch through them. </w:t>
-      </w:r>
-      <w:r>
-        <w:rPr>
-          <w:b/>
-          <w:bCs/>
-          <w:i/>
-          <w:iCs/>
-        </w:rPr>
-        <w:t xml:space="preserve">(3,5)</w:t>
+        <w:t xml:space="preserve">Step by step: left 2 gives </w:t>
+      </w:r>
+      <w:r>
+        <w:rPr>
+          <w:i/>
+          <w:iCs/>
+        </w:rPr>
+        <w:t xml:space="preserve">(−4,0),(−2,−2),(0,0)</w:t>
+      </w:r>
+      <w:r>
+        <w:t xml:space="preserve">. Reflecting across the </w:t>
+      </w:r>
+      <w:r>
+        <w:rPr>
+          <w:i/>
+          <w:iCs/>
+        </w:rPr>
+        <w:t xml:space="preserve">x</w:t>
+      </w:r>
+      <w:r>
+        <w:t xml:space="preserve">-axis changes the sign of each </w:t>
+      </w:r>
+      <w:r>
+        <w:rPr>
+          <w:i/>
+          <w:iCs/>
+        </w:rPr>
+        <w:t xml:space="preserve">y</w:t>
+      </w:r>
+      <w:r>
+        <w:t xml:space="preserve">: </w:t>
+      </w:r>
+      <w:r>
+        <w:rPr>
+          <w:i/>
+          <w:iCs/>
+        </w:rPr>
+        <w:t xml:space="preserve">(−4,0),(−2,2),(0,0)</w:t>
+      </w:r>
+      <w:r>
+        <w:t xml:space="preserve">. Down 1 gives </w:t>
+      </w:r>
+      <w:r>
+        <w:rPr>
+          <w:i/>
+          <w:iCs/>
+        </w:rPr>
+        <w:t xml:space="preserve">(−4,−1),(−2,1),(0,−1)</w:t>
+      </w:r>
+      <w:r>
+        <w:t xml:space="preserve">. This </w:t>
+      </w:r>
+      <w:r>
+        <w:rPr>
+          <w:i/>
+          <w:iCs/>
+        </w:rPr>
+        <w:t xml:space="preserve">f</w:t>
+      </w:r>
+      <w:r>
+        <w:t xml:space="preserve"> started upside down, so the reflection turns it right side up: an arch with its top at </w:t>
+      </w:r>
+      <w:r>
+        <w:rPr>
+          <w:i/>
+          <w:iCs/>
+        </w:rPr>
+        <w:t xml:space="preserve">(−2,1)</w:t>
+      </w:r>
+      <w:r>
+        <w:t xml:space="preserve">. The list with </w:t>
+      </w:r>
+      <w:r>
+        <w:rPr>
+          <w:i/>
+          <w:iCs/>
+        </w:rPr>
+        <w:t xml:space="preserve">(−2,−3)</w:t>
+      </w:r>
+      <w:r>
+        <w:t xml:space="preserve"> skips the reflection; the one starting at </w:t>
+      </w:r>
+      <w:r>
+        <w:rPr>
+          <w:i/>
+          <w:iCs/>
+        </w:rPr>
+        <w:t xml:space="preserve">(0,−1)</w:t>
+      </w:r>
+      <w:r>
+        <w:t xml:space="preserve"> goes right; and </w:t>
+      </w:r>
+      <w:r>
+        <w:rPr>
+          <w:i/>
+          <w:iCs/>
+        </w:rPr>
+        <w:t xml:space="preserve">(−4,1),(−2,3),(0,1)</w:t>
+      </w:r>
+      <w:r>
+        <w:t xml:space="preserve"> shifts down before reflecting. </w:t>
+      </w:r>
+      <w:r>
+        <w:rPr>
+          <w:b/>
+          <w:bCs/>
+          <w:i/>
+          <w:iCs/>
+        </w:rPr>
+        <w:t xml:space="preserve">(−4,−1), (−2,1), (0,−1)</w:t>
       </w:r>
       <w:r>
         <w:rPr>
@@ -1943,7 +1940,17 @@
         <w:t xml:space="preserve">[−6,−2]</w:t>
       </w:r>
       <w:r>
-        <w:t xml:space="preserve"> goes left, and </w:t>
+        <w:t xml:space="preserve"> goes left, </w:t>
+      </w:r>
+      <w:r>
+        <w:rPr>
+          <w:i/>
+          <w:iCs/>
+        </w:rPr>
+        <w:t xml:space="preserve">[−2,2]</w:t>
+      </w:r>
+      <w:r>
+        <w:t xml:space="preserve"> forgets that the sideways shift moves the domain, and </w:t>
       </w:r>
       <w:r>
         <w:rPr>
@@ -1990,7 +1997,7 @@
           <wp:inline distT="0" distB="0" distL="0" distR="0">
             <wp:extent cx="2524125" cy="2476500"/>
             <wp:effectExtent t="0" r="0" b="0" l="0"/>
-            <wp:docPr id="1" name="mg1" descr="The graph of f, dashed, and the graph of g, solid. Plotted data: Grid from −8 to 8. Dashed: the graph of f, the arch y = 4 − x squared from (−2, 0) up to (0, 4) and down to (2, 0). Solid: the graph of g, the same arch shape from (−5, −2) up to its top point (−3, 2) and down to (−1, −2). The three points of g are labeled." title="The graph of f, dashed, and the graph of g, solid"/>
+            <wp:docPr id="1" name="mg1" descr="The graph of f, dashed, and the graph of g, solid. Plotted data: Grid from −8 to 8. Dashed: the graph of f, the V shape y = absolute value of x, minus 4, from (−2, −2) down to (0, −4) and up to (2, −2). Solid: the graph of g, a tent shape from (−1, −1) up to its peak (1, 1) and down to (3, −1). The three points of g are labeled." title="The graph of f, dashed, and the graph of g, solid"/>
             <wp:cNvGraphicFramePr>
               <a:graphicFrameLocks xmlns:a="http://schemas.openxmlformats.org/drawingml/2006/main" noChangeAspect="1"/>
             </wp:cNvGraphicFramePr>
@@ -2044,7 +2051,7 @@
           <w:sz w:val="22"/>
           <w:szCs w:val="22"/>
         </w:rPr>
-        <w:t xml:space="preserve">Grid from −8 to 8. Dashed: the graph of f, the arch y = 4 − x squared from (−2, 0) up to (0, 4) and down to (2, 0). Solid: the graph of g, the same arch shape from (−5, −2) up to its top point (−3, 2) and down to (−1, −2). The three points of g are labeled.</w:t>
+        <w:t xml:space="preserve">Grid from −8 to 8. Dashed: the graph of f, the V shape y = absolute value of x, minus 4, from (−2, −2) down to (0, −4) and up to (2, −2). Solid: the graph of g, a tent shape from (−1, −1) up to its peak (1, 1) and down to (3, −1). The three points of g are labeled.</w:t>
       </w:r>
     </w:p>
     <w:p>
@@ -2081,7 +2088,7 @@
           <w:i/>
           <w:iCs/>
         </w:rPr>
-        <w:t xml:space="preserve">g(x)=f(x−3)−2</w:t>
+        <w:t xml:space="preserve">g(x)=−f(x−1)−3</w:t>
       </w:r>
     </w:p>
     <w:p>
@@ -2101,7 +2108,7 @@
           <w:i/>
           <w:iCs/>
         </w:rPr>
-        <w:t xml:space="preserve">g(x)=f(x+3)+2</w:t>
+        <w:t xml:space="preserve">g(x)=f(x−1)+5</w:t>
       </w:r>
     </w:p>
     <w:p>
@@ -2121,7 +2128,7 @@
           <w:i/>
           <w:iCs/>
         </w:rPr>
-        <w:t xml:space="preserve">g(x)=f(x+2)−3</w:t>
+        <w:t xml:space="preserve">g(x)=−f(x+1)−3</w:t>
       </w:r>
     </w:p>
     <w:p>
@@ -2141,7 +2148,7 @@
           <w:i/>
           <w:iCs/>
         </w:rPr>
-        <w:t xml:space="preserve">g(x)=f(x+3)−2</w:t>
+        <w:t xml:space="preserve">g(x)=−f(x−1)+3</w:t>
       </w:r>
     </w:p>
     <w:p>
@@ -2158,86 +2165,136 @@
         <w:spacing w:after="120" w:before="80" w:line="300"/>
       </w:pPr>
       <w:r>
-        <w:t xml:space="preserve">Compare the top points: </w:t>
-      </w:r>
-      <w:r>
-        <w:rPr>
-          <w:i/>
-          <w:iCs/>
-        </w:rPr>
-        <w:t xml:space="preserve">(0,4)</w:t>
-      </w:r>
-      <w:r>
-        <w:t xml:space="preserve"> moved to </w:t>
-      </w:r>
-      <w:r>
-        <w:rPr>
-          <w:i/>
-          <w:iCs/>
-        </w:rPr>
-        <w:t xml:space="preserve">(−3,2)</w:t>
-      </w:r>
-      <w:r>
-        <w:t xml:space="preserve">, so the graph went left 3 and down 2. The arch is still right side up, so there is no reflection. Left 3 is </w:t>
-      </w:r>
-      <w:r>
-        <w:rPr>
-          <w:i/>
-          <w:iCs/>
-        </w:rPr>
-        <w:t xml:space="preserve">x+3</w:t>
-      </w:r>
-      <w:r>
-        <w:t xml:space="preserve"> inside, and down 2 is </w:t>
-      </w:r>
-      <w:r>
-        <w:rPr>
-          <w:i/>
-          <w:iCs/>
-        </w:rPr>
-        <w:t xml:space="preserve">−2</w:t>
-      </w:r>
-      <w:r>
-        <w:t xml:space="preserve"> outside. The </w:t>
-      </w:r>
-      <w:r>
-        <w:rPr>
-          <w:i/>
-          <w:iCs/>
-        </w:rPr>
-        <w:t xml:space="preserve">x−3</w:t>
-      </w:r>
-      <w:r>
-        <w:t xml:space="preserve"> version goes right, the </w:t>
-      </w:r>
-      <w:r>
-        <w:rPr>
-          <w:i/>
-          <w:iCs/>
-        </w:rPr>
-        <w:t xml:space="preserve">+2</w:t>
-      </w:r>
-      <w:r>
-        <w:t xml:space="preserve"> version goes up, and </w:t>
-      </w:r>
-      <w:r>
-        <w:rPr>
-          <w:i/>
-          <w:iCs/>
-        </w:rPr>
-        <w:t xml:space="preserve">f(x+2)−3</w:t>
-      </w:r>
-      <w:r>
-        <w:t xml:space="preserve"> swaps the 3 and the 2. </w:t>
-      </w:r>
-      <w:r>
-        <w:rPr>
-          <w:b/>
-          <w:bCs/>
-          <w:i/>
-          <w:iCs/>
-        </w:rPr>
-        <w:t xml:space="preserve">g(x)=f(x+3)−2</w:t>
+        <w:t xml:space="preserve">The V has become a tent, so there is a reflection: a minus in front. The middle point moved from </w:t>
+      </w:r>
+      <w:r>
+        <w:rPr>
+          <w:i/>
+          <w:iCs/>
+        </w:rPr>
+        <w:t xml:space="preserve">x=0</w:t>
+      </w:r>
+      <w:r>
+        <w:t xml:space="preserve"> to </w:t>
+      </w:r>
+      <w:r>
+        <w:rPr>
+          <w:i/>
+          <w:iCs/>
+        </w:rPr>
+        <w:t xml:space="preserve">x=1</w:t>
+      </w:r>
+      <w:r>
+        <w:t xml:space="preserve">, right 1, so </w:t>
+      </w:r>
+      <w:r>
+        <w:rPr>
+          <w:i/>
+          <w:iCs/>
+        </w:rPr>
+        <w:t xml:space="preserve">x−1</w:t>
+      </w:r>
+      <w:r>
+        <w:t xml:space="preserve"> inside. After the shift and the reflection, </w:t>
+      </w:r>
+      <w:r>
+        <w:rPr>
+          <w:i/>
+          <w:iCs/>
+        </w:rPr>
+        <w:t xml:space="preserve">(0,−4)</w:t>
+      </w:r>
+      <w:r>
+        <w:t xml:space="preserve"> would be at </w:t>
+      </w:r>
+      <w:r>
+        <w:rPr>
+          <w:i/>
+          <w:iCs/>
+        </w:rPr>
+        <w:t xml:space="preserve">(1,4)</w:t>
+      </w:r>
+      <w:r>
+        <w:t xml:space="preserve">; it is at </w:t>
+      </w:r>
+      <w:r>
+        <w:rPr>
+          <w:i/>
+          <w:iCs/>
+        </w:rPr>
+        <w:t xml:space="preserve">(1,1)</w:t>
+      </w:r>
+      <w:r>
+        <w:t xml:space="preserve">, so down 3. Check an end: </w:t>
+      </w:r>
+      <w:r>
+        <w:rPr>
+          <w:i/>
+          <w:iCs/>
+        </w:rPr>
+        <w:t xml:space="preserve">g(−1)=−f(−2)−3=−(−2)−3=−1</w:t>
+      </w:r>
+      <w:r>
+        <w:t xml:space="preserve">. </w:t>
+      </w:r>
+      <w:r>
+        <w:rPr>
+          <w:i/>
+          <w:iCs/>
+        </w:rPr>
+        <w:t xml:space="preserve">f(x−1)+5</w:t>
+      </w:r>
+      <w:r>
+        <w:t xml:space="preserve"> puts the middle point at </w:t>
+      </w:r>
+      <w:r>
+        <w:rPr>
+          <w:i/>
+          <w:iCs/>
+        </w:rPr>
+        <w:t xml:space="preserve">(1,1)</w:t>
+      </w:r>
+      <w:r>
+        <w:t xml:space="preserve"> too, but keeps the V shape; </w:t>
+      </w:r>
+      <w:r>
+        <w:rPr>
+          <w:i/>
+          <w:iCs/>
+        </w:rPr>
+        <w:t xml:space="preserve">x+1</w:t>
+      </w:r>
+      <w:r>
+        <w:t xml:space="preserve"> goes left; and </w:t>
+      </w:r>
+      <w:r>
+        <w:rPr>
+          <w:i/>
+          <w:iCs/>
+        </w:rPr>
+        <w:t xml:space="preserve">+3</w:t>
+      </w:r>
+      <w:r>
+        <w:t xml:space="preserve"> would put the peak at </w:t>
+      </w:r>
+      <w:r>
+        <w:rPr>
+          <w:i/>
+          <w:iCs/>
+        </w:rPr>
+        <w:t xml:space="preserve">(1,7)</w:t>
+      </w:r>
+      <w:r>
+        <w:t xml:space="preserve">. </w:t>
+      </w:r>
+      <w:r>
+        <w:rPr>
+          <w:b/>
+          <w:bCs/>
+          <w:i/>
+          <w:iCs/>
+        </w:rPr>
+        <w:t xml:space="preserve">g(x)=−f(x−1)−3</w:t>
       </w:r>
       <w:r>
         <w:rPr>
@@ -3367,7 +3424,7 @@
         <w:t xml:space="preserve">(2,2)</w:t>
       </w:r>
       <w:r>
-        <w:t xml:space="preserve"> change the input, and </w:t>
+        <w:t xml:space="preserve"> keep the height at 2, but a number outside changes the height; and </w:t>
       </w:r>
       <w:r>
         <w:rPr>
@@ -3651,27 +3708,17 @@
         <w:t xml:space="preserve">(0,8)</w:t>
       </w:r>
       <w:r>
-        <w:t xml:space="preserve"> multiplies by 2, and the two lists that move the endpoints change the inputs instead, which is </w:t>
-      </w:r>
-      <w:r>
-        <w:rPr>
-          <w:i/>
-          <w:iCs/>
-        </w:rPr>
-        <w:t xml:space="preserve">f(2x)</w:t>
-      </w:r>
-      <w:r>
-        <w:t xml:space="preserve"> or </w:t>
-      </w:r>
-      <w:r>
-        <w:rPr>
-          <w:i/>
-          <w:iCs/>
-        </w:rPr>
-        <w:t xml:space="preserve">f(1/2x)</w:t>
-      </w:r>
-      <w:r>
-        <w:t xml:space="preserve">. </w:t>
+        <w:t xml:space="preserve"> multiplies by 2, and the two lists that move the endpoints change the </w:t>
+      </w:r>
+      <w:r>
+        <w:rPr>
+          <w:i/>
+          <w:iCs/>
+        </w:rPr>
+        <w:t xml:space="preserve">x</w:t>
+      </w:r>
+      <w:r>
+        <w:t xml:space="preserve">-coordinates, which a number outside never does. </w:t>
       </w:r>
       <w:r>
         <w:rPr>
@@ -4114,39 +4161,39 @@
         <w:t xml:space="preserve">A.  </w:t>
       </w:r>
       <w:r>
+        <w:t xml:space="preserve">(4, −2)</w:t>
+      </w:r>
+    </w:p>
+    <w:p>
+      <w:pPr>
+        <w:spacing w:after="40" w:before="20"/>
+        <w:ind w:left="360"/>
+      </w:pPr>
+      <w:r>
+        <w:rPr>
+          <w:b/>
+          <w:bCs/>
+        </w:rPr>
+        <w:t xml:space="preserve">B.  </w:t>
+      </w:r>
+      <w:r>
+        <w:t xml:space="preserve">(−4, −2)</w:t>
+      </w:r>
+    </w:p>
+    <w:p>
+      <w:pPr>
+        <w:spacing w:after="40" w:before="20"/>
+        <w:ind w:left="360"/>
+      </w:pPr>
+      <w:r>
+        <w:rPr>
+          <w:b/>
+          <w:bCs/>
+        </w:rPr>
+        <w:t xml:space="preserve">C.  </w:t>
+      </w:r>
+      <w:r>
         <w:t xml:space="preserve">(−4, 2)</w:t>
-      </w:r>
-    </w:p>
-    <w:p>
-      <w:pPr>
-        <w:spacing w:after="40" w:before="20"/>
-        <w:ind w:left="360"/>
-      </w:pPr>
-      <w:r>
-        <w:rPr>
-          <w:b/>
-          <w:bCs/>
-        </w:rPr>
-        <w:t xml:space="preserve">B.  </w:t>
-      </w:r>
-      <w:r>
-        <w:t xml:space="preserve">(−4, −2)</w:t>
-      </w:r>
-    </w:p>
-    <w:p>
-      <w:pPr>
-        <w:spacing w:after="40" w:before="20"/>
-        <w:ind w:left="360"/>
-      </w:pPr>
-      <w:r>
-        <w:rPr>
-          <w:b/>
-          <w:bCs/>
-        </w:rPr>
-        <w:t xml:space="preserve">C.  </w:t>
-      </w:r>
-      <w:r>
-        <w:t xml:space="preserve">(4, −2)</w:t>
       </w:r>
     </w:p>
     <w:p>
@@ -4286,7 +4333,7 @@
         <w:t xml:space="preserve">−f(x)</w:t>
       </w:r>
       <w:r>
-        <w:t xml:space="preserve">, and </w:t>
+        <w:t xml:space="preserve">, </w:t>
       </w:r>
       <w:r>
         <w:rPr>
@@ -4296,7 +4343,17 @@
         <w:t xml:space="preserve">(−4,−2)</w:t>
       </w:r>
       <w:r>
-        <w:t xml:space="preserve"> reflects across both axes. </w:t>
+        <w:t xml:space="preserve"> reflects across both axes; and </w:t>
+      </w:r>
+      <w:r>
+        <w:rPr>
+          <w:i/>
+          <w:iCs/>
+        </w:rPr>
+        <w:t xml:space="preserve">(2,−4)</w:t>
+      </w:r>
+      <w:r>
+        <w:t xml:space="preserve"> swaps the coordinates and changes a sign. </w:t>
       </w:r>
       <w:r>
         <w:rPr>
@@ -4464,7 +4521,17 @@
         <w:t xml:space="preserve">g(−3)=f(0)</w:t>
       </w:r>
       <w:r>
-        <w:t xml:space="preserve">. </w:t>
+        <w:t xml:space="preserve">. A shift up 3 would be </w:t>
+      </w:r>
+      <w:r>
+        <w:rPr>
+          <w:i/>
+          <w:iCs/>
+        </w:rPr>
+        <w:t xml:space="preserve">f(x)+3</w:t>
+      </w:r>
+      <w:r>
+        <w:t xml:space="preserve">, with the 3 outside; and with no minus sign anywhere, there is no reflection. </w:t>
       </w:r>
       <w:r>
         <w:rPr>
@@ -4644,6 +4711,36 @@
       </w:r>
       <w:r>
         <w:rPr>
+          <w:i/>
+          <w:iCs/>
+        </w:rPr>
+        <w:t xml:space="preserve">(−4,3)</w:t>
+      </w:r>
+      <w:r>
+        <w:t xml:space="preserve"> reads the inside sign at face value, </w:t>
+      </w:r>
+      <w:r>
+        <w:rPr>
+          <w:i/>
+          <w:iCs/>
+        </w:rPr>
+        <w:t xml:space="preserve">(4,5)</w:t>
+      </w:r>
+      <w:r>
+        <w:t xml:space="preserve"> reads the outside sign backwards, and </w:t>
+      </w:r>
+      <w:r>
+        <w:rPr>
+          <w:i/>
+          <w:iCs/>
+        </w:rPr>
+        <w:t xml:space="preserve">(−4,5)</w:t>
+      </w:r>
+      <w:r>
+        <w:t xml:space="preserve"> does both. </w:t>
+      </w:r>
+      <w:r>
+        <w:rPr>
           <w:b/>
           <w:bCs/>
         </w:rPr>
@@ -4704,7 +4801,7 @@
         <w:t xml:space="preserve">A.  </w:t>
       </w:r>
       <w:r>
-        <w:t xml:space="preserve">There is no mistake; the order does not matter.</w:t>
+        <w:t xml:space="preserve">There is no mistake.</w:t>
       </w:r>
     </w:p>
     <w:p>
@@ -4799,7 +4896,37 @@
         <w:t xml:space="preserve">−(f(x−1)+2)=−f(x−1)−2</w:t>
       </w:r>
       <w:r>
-        <w:t xml:space="preserve">, which ends up 4 lower. </w:t>
+        <w:t xml:space="preserve">, which ends up 4 lower, so the order does matter. </w:t>
+      </w:r>
+      <w:r>
+        <w:rPr>
+          <w:i/>
+          <w:iCs/>
+        </w:rPr>
+        <w:t xml:space="preserve">x−1</w:t>
+      </w:r>
+      <w:r>
+        <w:t xml:space="preserve"> does shift right, and a reflection across the </w:t>
+      </w:r>
+      <w:r>
+        <w:rPr>
+          <w:i/>
+          <w:iCs/>
+        </w:rPr>
+        <w:t xml:space="preserve">y</w:t>
+      </w:r>
+      <w:r>
+        <w:t xml:space="preserve">-axis would need </w:t>
+      </w:r>
+      <w:r>
+        <w:rPr>
+          <w:i/>
+          <w:iCs/>
+        </w:rPr>
+        <w:t xml:space="preserve">f(−x)</w:t>
+      </w:r>
+      <w:r>
+        <w:t xml:space="preserve">. </w:t>
       </w:r>
       <w:r>
         <w:rPr>
@@ -5015,7 +5142,17 @@
         <w:t xml:space="preserve">x</w:t>
       </w:r>
       <w:r>
-        <w:t xml:space="preserve">. For CheckIt's three shapes, which are symmetric, that would not change the graph at all. </w:t>
+        <w:t xml:space="preserve">. For CheckIt's three shapes, which are symmetric, that would not change the graph at all. The minus multiplies, so it does not shift the graph down; and a reflection across the line </w:t>
+      </w:r>
+      <w:r>
+        <w:rPr>
+          <w:i/>
+          <w:iCs/>
+        </w:rPr>
+        <w:t xml:space="preserve">y=x</w:t>
+      </w:r>
+      <w:r>
+        <w:t xml:space="preserve"> swaps the coordinates, which is a different idea. </w:t>
       </w:r>
       <w:r>
         <w:rPr>
@@ -5079,7 +5216,7 @@
         <w:t xml:space="preserve">A.  </w:t>
       </w:r>
       <w:r>
-        <w:t xml:space="preserve">It should be (2, 1), since x + 2 moves right.</w:t>
+        <w:t xml:space="preserve">There is no mistake.</w:t>
       </w:r>
     </w:p>
     <w:p>
@@ -5095,7 +5232,7 @@
         <w:t xml:space="preserve">B.  </w:t>
       </w:r>
       <w:r>
-        <w:t xml:space="preserve">There is no mistake.</w:t>
+        <w:t xml:space="preserve">The reflection was skipped; it should be (−2, −7).</w:t>
       </w:r>
     </w:p>
     <w:p>
@@ -5111,7 +5248,7 @@
         <w:t xml:space="preserve">C.  </w:t>
       </w:r>
       <w:r>
-        <w:t xml:space="preserve">The reflection was skipped; it should be (−2, −7).</w:t>
+        <w:t xml:space="preserve">It should be (−2, −1), since −4 − 3 = −1 after reflecting.</w:t>
       </w:r>
     </w:p>
     <w:p>
@@ -5127,7 +5264,7 @@
         <w:t xml:space="preserve">D.  </w:t>
       </w:r>
       <w:r>
-        <w:t xml:space="preserve">It should be (−2, −1), reflecting after the shift down.</w:t>
+        <w:t xml:space="preserve">It should be (−5, −4), since the 3 moves it 3 more to the left.</w:t>
       </w:r>
     </w:p>
     <w:p>
@@ -5195,6 +5332,36 @@
       </w:r>
       <w:r>
         <w:t xml:space="preserve">. </w:t>
+      </w:r>
+      <w:r>
+        <w:rPr>
+          <w:i/>
+          <w:iCs/>
+        </w:rPr>
+        <w:t xml:space="preserve">−4−3</w:t>
+      </w:r>
+      <w:r>
+        <w:t xml:space="preserve"> is </w:t>
+      </w:r>
+      <w:r>
+        <w:rPr>
+          <w:i/>
+          <w:iCs/>
+        </w:rPr>
+        <w:t xml:space="preserve">−7</w:t>
+      </w:r>
+      <w:r>
+        <w:t xml:space="preserve">, not </w:t>
+      </w:r>
+      <w:r>
+        <w:rPr>
+          <w:i/>
+          <w:iCs/>
+        </w:rPr>
+        <w:t xml:space="preserve">−1</w:t>
+      </w:r>
+      <w:r>
+        <w:t xml:space="preserve">; and the 3 is outside the parentheses, so it moves the graph down, not sideways. </w:t>
       </w:r>
       <w:r>
         <w:rPr>

</xml_diff>